<commit_message>
Reordeno canciones 3-8 para variar el ritmo, actualizo cuaderno de bocetos
Co-Authored-By: Claude Sonnet 5 <noreply@anthropic.com>
</commit_message>
<xml_diff>
--- a/media/gracias-bocetos.docx
+++ b/media/gracias-bocetos.docx
@@ -3104,21 +3104,7 @@
           <w:sz w:val="22"/>
           <w:szCs w:val="22"/>
         </w:rPr>
-        <w:t xml:space="preserve">Pero el tenerte se hizo </w:t>
-      </w:r>
-      <w:r>
-        <w:rPr>
-          <w:sz w:val="22"/>
-          <w:szCs w:val="22"/>
-        </w:rPr>
-        <w:t>más</w:t>
-      </w:r>
-      <w:r>
-        <w:rPr>
-          <w:sz w:val="22"/>
-          <w:szCs w:val="22"/>
-        </w:rPr>
-        <w:t xml:space="preserve"> viable</w:t>
+        <w:t>Pero el tenerte se hizo más viable</w:t>
       </w:r>
     </w:p>
     <w:p>
@@ -6023,7 +6009,23 @@
           <w:sz w:val="22"/>
           <w:szCs w:val="22"/>
         </w:rPr>
-        <w:t xml:space="preserve"> se que si tuviera a mi peor versión frente de mi</w:t>
+        <w:t xml:space="preserve"> </w:t>
+      </w:r>
+      <w:proofErr w:type="spellStart"/>
+      <w:r>
+        <w:rPr>
+          <w:sz w:val="22"/>
+          <w:szCs w:val="22"/>
+        </w:rPr>
+        <w:t>se</w:t>
+      </w:r>
+      <w:proofErr w:type="spellEnd"/>
+      <w:r>
+        <w:rPr>
+          <w:sz w:val="22"/>
+          <w:szCs w:val="22"/>
+        </w:rPr>
+        <w:t xml:space="preserve"> que si tuviera a mi peor versión frente de mi</w:t>
       </w:r>
     </w:p>
     <w:p>
@@ -6163,7 +6165,23 @@
           <w:sz w:val="22"/>
           <w:szCs w:val="22"/>
         </w:rPr>
-        <w:t>, pero también se que</w:t>
+        <w:t xml:space="preserve">, pero también </w:t>
+      </w:r>
+      <w:proofErr w:type="spellStart"/>
+      <w:r>
+        <w:rPr>
+          <w:sz w:val="22"/>
+          <w:szCs w:val="22"/>
+        </w:rPr>
+        <w:t>se</w:t>
+      </w:r>
+      <w:proofErr w:type="spellEnd"/>
+      <w:r>
+        <w:rPr>
+          <w:sz w:val="22"/>
+          <w:szCs w:val="22"/>
+        </w:rPr>
+        <w:t xml:space="preserve"> que</w:t>
       </w:r>
       <w:r>
         <w:rPr>
@@ -7691,13 +7709,22 @@
         </w:rPr>
         <w:t xml:space="preserve">Cuando </w:t>
       </w:r>
+      <w:proofErr w:type="spellStart"/>
       <w:proofErr w:type="gramStart"/>
       <w:r>
         <w:rPr>
           <w:rStyle w:val="xy9tlov"/>
           <w:rFonts w:ascii="Segoe UI Emoji" w:hAnsi="Segoe UI Emoji" w:cs="Segoe UI Emoji"/>
         </w:rPr>
-        <w:t>tenia  14</w:t>
+        <w:t>tenia</w:t>
+      </w:r>
+      <w:proofErr w:type="spellEnd"/>
+      <w:r>
+        <w:rPr>
+          <w:rStyle w:val="xy9tlov"/>
+          <w:rFonts w:ascii="Segoe UI Emoji" w:hAnsi="Segoe UI Emoji" w:cs="Segoe UI Emoji"/>
+        </w:rPr>
+        <w:t xml:space="preserve">  14</w:t>
       </w:r>
       <w:proofErr w:type="gramEnd"/>
       <w:r>
@@ -9891,6 +9918,3131 @@
           <w:szCs w:val="22"/>
         </w:rPr>
       </w:pPr>
+    </w:p>
+    <w:p>
+      <w:pPr>
+        <w:pStyle w:val="NormalWeb"/>
+        <w:spacing w:line="360" w:lineRule="auto"/>
+        <w:rPr>
+          <w:sz w:val="22"/>
+          <w:szCs w:val="22"/>
+        </w:rPr>
+      </w:pPr>
+    </w:p>
+    <w:p>
+      <w:pPr>
+        <w:pStyle w:val="NormalWeb"/>
+        <w:spacing w:line="360" w:lineRule="auto"/>
+        <w:rPr>
+          <w:b/>
+          <w:bCs/>
+          <w:sz w:val="22"/>
+          <w:szCs w:val="22"/>
+        </w:rPr>
+      </w:pPr>
+      <w:r>
+        <w:rPr>
+          <w:b/>
+          <w:bCs/>
+          <w:sz w:val="22"/>
+          <w:szCs w:val="22"/>
+        </w:rPr>
+        <w:t>TE ELIJO A TI</w:t>
+      </w:r>
+    </w:p>
+    <w:p>
+      <w:pPr>
+        <w:pStyle w:val="NormalWeb"/>
+        <w:spacing w:line="360" w:lineRule="auto"/>
+        <w:rPr>
+          <w:sz w:val="22"/>
+          <w:szCs w:val="22"/>
+        </w:rPr>
+      </w:pPr>
+      <w:r>
+        <w:rPr>
+          <w:sz w:val="22"/>
+          <w:szCs w:val="22"/>
+        </w:rPr>
+        <w:t>Nos abrazamos cada vez que podemos</w:t>
+      </w:r>
+    </w:p>
+    <w:p>
+      <w:pPr>
+        <w:pStyle w:val="NormalWeb"/>
+        <w:spacing w:line="360" w:lineRule="auto"/>
+        <w:rPr>
+          <w:sz w:val="22"/>
+          <w:szCs w:val="22"/>
+        </w:rPr>
+      </w:pPr>
+      <w:r>
+        <w:rPr>
+          <w:sz w:val="22"/>
+          <w:szCs w:val="22"/>
+        </w:rPr>
+        <w:t xml:space="preserve">Uno es suficiente para </w:t>
+      </w:r>
+      <w:proofErr w:type="gramStart"/>
+      <w:r>
+        <w:rPr>
+          <w:sz w:val="22"/>
+          <w:szCs w:val="22"/>
+        </w:rPr>
+        <w:t>recargarme  de</w:t>
+      </w:r>
+      <w:proofErr w:type="gramEnd"/>
+      <w:r>
+        <w:rPr>
+          <w:sz w:val="22"/>
+          <w:szCs w:val="22"/>
+        </w:rPr>
+        <w:t xml:space="preserve"> paz</w:t>
+      </w:r>
+    </w:p>
+    <w:p>
+      <w:pPr>
+        <w:pStyle w:val="NormalWeb"/>
+        <w:spacing w:line="360" w:lineRule="auto"/>
+        <w:rPr>
+          <w:sz w:val="22"/>
+          <w:szCs w:val="22"/>
+        </w:rPr>
+      </w:pPr>
+      <w:r>
+        <w:rPr>
+          <w:sz w:val="22"/>
+          <w:szCs w:val="22"/>
+        </w:rPr>
+        <w:t xml:space="preserve">Se que </w:t>
+      </w:r>
+      <w:r>
+        <w:rPr>
+          <w:sz w:val="22"/>
+          <w:szCs w:val="22"/>
+        </w:rPr>
+        <w:t xml:space="preserve">es único lo que tenemos </w:t>
+      </w:r>
+    </w:p>
+    <w:p>
+      <w:pPr>
+        <w:pStyle w:val="NormalWeb"/>
+        <w:spacing w:line="360" w:lineRule="auto"/>
+        <w:rPr>
+          <w:sz w:val="22"/>
+          <w:szCs w:val="22"/>
+        </w:rPr>
+      </w:pPr>
+      <w:r>
+        <w:rPr>
+          <w:sz w:val="22"/>
+          <w:szCs w:val="22"/>
+        </w:rPr>
+        <w:t>Preciado</w:t>
+      </w:r>
+      <w:r>
+        <w:rPr>
+          <w:sz w:val="22"/>
+          <w:szCs w:val="22"/>
+        </w:rPr>
+        <w:t>,</w:t>
+      </w:r>
+      <w:r>
+        <w:rPr>
+          <w:sz w:val="22"/>
+          <w:szCs w:val="22"/>
+        </w:rPr>
+        <w:t xml:space="preserve"> pero se </w:t>
+      </w:r>
+      <w:r>
+        <w:rPr>
+          <w:sz w:val="22"/>
+          <w:szCs w:val="22"/>
+        </w:rPr>
+        <w:t>que hay ciertos miedos</w:t>
+      </w:r>
+    </w:p>
+    <w:p>
+      <w:pPr>
+        <w:pStyle w:val="NormalWeb"/>
+        <w:spacing w:line="360" w:lineRule="auto"/>
+        <w:rPr>
+          <w:sz w:val="22"/>
+          <w:szCs w:val="22"/>
+        </w:rPr>
+      </w:pPr>
+    </w:p>
+    <w:p>
+      <w:pPr>
+        <w:pStyle w:val="NormalWeb"/>
+        <w:spacing w:line="360" w:lineRule="auto"/>
+        <w:rPr>
+          <w:sz w:val="22"/>
+          <w:szCs w:val="22"/>
+        </w:rPr>
+      </w:pPr>
+      <w:r>
+        <w:rPr>
+          <w:sz w:val="22"/>
+          <w:szCs w:val="22"/>
+        </w:rPr>
+        <w:t>No quiero</w:t>
+      </w:r>
+      <w:r>
+        <w:rPr>
+          <w:sz w:val="22"/>
+          <w:szCs w:val="22"/>
+        </w:rPr>
+        <w:t xml:space="preserve"> para mi</w:t>
+      </w:r>
+      <w:r>
+        <w:rPr>
+          <w:sz w:val="22"/>
+          <w:szCs w:val="22"/>
+        </w:rPr>
+        <w:t xml:space="preserve"> algo superficial</w:t>
+      </w:r>
+    </w:p>
+    <w:p>
+      <w:pPr>
+        <w:pStyle w:val="NormalWeb"/>
+        <w:spacing w:line="360" w:lineRule="auto"/>
+        <w:rPr>
+          <w:sz w:val="22"/>
+          <w:szCs w:val="22"/>
+        </w:rPr>
+      </w:pPr>
+      <w:r>
+        <w:rPr>
+          <w:sz w:val="22"/>
+          <w:szCs w:val="22"/>
+        </w:rPr>
+        <w:t>Quiero algo</w:t>
+      </w:r>
+      <w:r>
+        <w:rPr>
+          <w:sz w:val="22"/>
+          <w:szCs w:val="22"/>
+        </w:rPr>
+        <w:t>, autentico, para</w:t>
+      </w:r>
+      <w:r>
+        <w:rPr>
+          <w:sz w:val="22"/>
+          <w:szCs w:val="22"/>
+        </w:rPr>
+        <w:t xml:space="preserve"> recordar</w:t>
+      </w:r>
+    </w:p>
+    <w:p>
+      <w:pPr>
+        <w:pStyle w:val="NormalWeb"/>
+        <w:spacing w:line="360" w:lineRule="auto"/>
+        <w:rPr>
+          <w:sz w:val="22"/>
+          <w:szCs w:val="22"/>
+        </w:rPr>
+      </w:pPr>
+      <w:r>
+        <w:rPr>
+          <w:sz w:val="22"/>
+          <w:szCs w:val="22"/>
+        </w:rPr>
+        <w:t xml:space="preserve">Lo demás para </w:t>
+      </w:r>
+      <w:proofErr w:type="spellStart"/>
+      <w:r>
+        <w:rPr>
+          <w:sz w:val="22"/>
+          <w:szCs w:val="22"/>
+        </w:rPr>
+        <w:t>mi</w:t>
+      </w:r>
+      <w:proofErr w:type="spellEnd"/>
+      <w:r>
+        <w:rPr>
+          <w:sz w:val="22"/>
+          <w:szCs w:val="22"/>
+        </w:rPr>
+        <w:t xml:space="preserve">, me es tan </w:t>
+      </w:r>
+      <w:proofErr w:type="spellStart"/>
+      <w:r>
+        <w:rPr>
+          <w:sz w:val="22"/>
+          <w:szCs w:val="22"/>
+        </w:rPr>
+        <w:t>vanal</w:t>
+      </w:r>
+      <w:proofErr w:type="spellEnd"/>
+    </w:p>
+    <w:p>
+      <w:pPr>
+        <w:pStyle w:val="NormalWeb"/>
+        <w:spacing w:line="360" w:lineRule="auto"/>
+        <w:rPr>
+          <w:sz w:val="22"/>
+          <w:szCs w:val="22"/>
+        </w:rPr>
+      </w:pPr>
+      <w:r>
+        <w:rPr>
+          <w:sz w:val="22"/>
+          <w:szCs w:val="22"/>
+        </w:rPr>
+        <w:t xml:space="preserve">Quiero </w:t>
+      </w:r>
+      <w:r>
+        <w:rPr>
+          <w:sz w:val="22"/>
+          <w:szCs w:val="22"/>
+        </w:rPr>
+        <w:t xml:space="preserve">Algo que valga la pena </w:t>
+      </w:r>
+      <w:r>
+        <w:rPr>
+          <w:sz w:val="22"/>
+          <w:szCs w:val="22"/>
+        </w:rPr>
+        <w:t>arriesgar</w:t>
+      </w:r>
+    </w:p>
+    <w:p>
+      <w:pPr>
+        <w:pStyle w:val="NormalWeb"/>
+        <w:spacing w:line="360" w:lineRule="auto"/>
+        <w:rPr>
+          <w:sz w:val="22"/>
+          <w:szCs w:val="22"/>
+        </w:rPr>
+      </w:pPr>
+      <w:proofErr w:type="gramStart"/>
+      <w:r>
+        <w:rPr>
+          <w:sz w:val="22"/>
+          <w:szCs w:val="22"/>
+        </w:rPr>
+        <w:t>Todo(</w:t>
+      </w:r>
+      <w:proofErr w:type="gramEnd"/>
+      <w:r>
+        <w:rPr>
+          <w:sz w:val="22"/>
+          <w:szCs w:val="22"/>
+        </w:rPr>
+        <w:t>voz en off)</w:t>
+      </w:r>
+    </w:p>
+    <w:p>
+      <w:pPr>
+        <w:pStyle w:val="NormalWeb"/>
+        <w:spacing w:line="360" w:lineRule="auto"/>
+        <w:rPr>
+          <w:sz w:val="22"/>
+          <w:szCs w:val="22"/>
+        </w:rPr>
+      </w:pPr>
+      <w:proofErr w:type="spellStart"/>
+      <w:r>
+        <w:rPr>
+          <w:sz w:val="22"/>
+          <w:szCs w:val="22"/>
+        </w:rPr>
+        <w:t>Precoro</w:t>
+      </w:r>
+      <w:proofErr w:type="spellEnd"/>
+      <w:r>
+        <w:rPr>
+          <w:sz w:val="22"/>
+          <w:szCs w:val="22"/>
+        </w:rPr>
+        <w:t>**</w:t>
+      </w:r>
+    </w:p>
+    <w:p>
+      <w:pPr>
+        <w:pStyle w:val="NormalWeb"/>
+        <w:spacing w:line="360" w:lineRule="auto"/>
+        <w:rPr>
+          <w:sz w:val="22"/>
+          <w:szCs w:val="22"/>
+        </w:rPr>
+      </w:pPr>
+      <w:r>
+        <w:rPr>
+          <w:sz w:val="22"/>
+          <w:szCs w:val="22"/>
+        </w:rPr>
+        <w:t>Una vida dura te toco enfrentar</w:t>
+      </w:r>
+      <w:r>
+        <w:rPr>
+          <w:sz w:val="22"/>
+          <w:szCs w:val="22"/>
+        </w:rPr>
+        <w:t xml:space="preserve">, lo se </w:t>
+      </w:r>
+    </w:p>
+    <w:p>
+      <w:pPr>
+        <w:pStyle w:val="NormalWeb"/>
+        <w:spacing w:line="360" w:lineRule="auto"/>
+        <w:rPr>
+          <w:sz w:val="22"/>
+          <w:szCs w:val="22"/>
+        </w:rPr>
+      </w:pPr>
+      <w:r>
+        <w:rPr>
+          <w:sz w:val="22"/>
+          <w:szCs w:val="22"/>
+        </w:rPr>
+        <w:t xml:space="preserve">A cualquiera le pudo pasar, a </w:t>
+      </w:r>
+      <w:proofErr w:type="spellStart"/>
+      <w:r>
+        <w:rPr>
+          <w:sz w:val="22"/>
+          <w:szCs w:val="22"/>
+        </w:rPr>
+        <w:t>mi</w:t>
+      </w:r>
+      <w:proofErr w:type="spellEnd"/>
+      <w:r>
+        <w:rPr>
+          <w:sz w:val="22"/>
+          <w:szCs w:val="22"/>
+        </w:rPr>
+        <w:t xml:space="preserve"> </w:t>
+      </w:r>
+      <w:r>
+        <w:rPr>
+          <w:sz w:val="22"/>
+          <w:szCs w:val="22"/>
+        </w:rPr>
+        <w:t>me paso</w:t>
+      </w:r>
+    </w:p>
+    <w:p>
+      <w:pPr>
+        <w:pStyle w:val="NormalWeb"/>
+        <w:spacing w:line="360" w:lineRule="auto"/>
+        <w:rPr>
+          <w:sz w:val="22"/>
+          <w:szCs w:val="22"/>
+        </w:rPr>
+      </w:pPr>
+      <w:r>
+        <w:rPr>
+          <w:sz w:val="22"/>
+          <w:szCs w:val="22"/>
+        </w:rPr>
+        <w:t>Estando solo, fue lo peor</w:t>
+      </w:r>
+    </w:p>
+    <w:p>
+      <w:pPr>
+        <w:pStyle w:val="NormalWeb"/>
+        <w:spacing w:line="360" w:lineRule="auto"/>
+        <w:rPr>
+          <w:sz w:val="22"/>
+          <w:szCs w:val="22"/>
+        </w:rPr>
+      </w:pPr>
+      <w:r>
+        <w:rPr>
+          <w:sz w:val="22"/>
+          <w:szCs w:val="22"/>
+        </w:rPr>
+        <w:t>¿Enserio crees que te dejare?</w:t>
+      </w:r>
+    </w:p>
+    <w:p>
+      <w:pPr>
+        <w:pStyle w:val="NormalWeb"/>
+        <w:spacing w:line="360" w:lineRule="auto"/>
+        <w:rPr>
+          <w:sz w:val="22"/>
+          <w:szCs w:val="22"/>
+        </w:rPr>
+      </w:pPr>
+      <w:r>
+        <w:rPr>
+          <w:sz w:val="22"/>
+          <w:szCs w:val="22"/>
+        </w:rPr>
+        <w:t>Coro**</w:t>
+      </w:r>
+    </w:p>
+    <w:p>
+      <w:pPr>
+        <w:pStyle w:val="NormalWeb"/>
+        <w:spacing w:line="360" w:lineRule="auto"/>
+        <w:rPr>
+          <w:sz w:val="22"/>
+          <w:szCs w:val="22"/>
+        </w:rPr>
+      </w:pPr>
+      <w:r>
+        <w:rPr>
+          <w:sz w:val="22"/>
+          <w:szCs w:val="22"/>
+        </w:rPr>
+        <w:t xml:space="preserve">Te </w:t>
+      </w:r>
+      <w:r>
+        <w:rPr>
+          <w:sz w:val="22"/>
+          <w:szCs w:val="22"/>
+        </w:rPr>
+        <w:t>quiero,</w:t>
+      </w:r>
+      <w:r>
+        <w:rPr>
+          <w:sz w:val="22"/>
+          <w:szCs w:val="22"/>
+        </w:rPr>
+        <w:t xml:space="preserve"> aunque este</w:t>
+      </w:r>
+      <w:r>
+        <w:rPr>
+          <w:sz w:val="22"/>
+          <w:szCs w:val="22"/>
+        </w:rPr>
+        <w:t>s lejos</w:t>
+      </w:r>
+    </w:p>
+    <w:p>
+      <w:pPr>
+        <w:pStyle w:val="NormalWeb"/>
+        <w:spacing w:line="360" w:lineRule="auto"/>
+        <w:rPr>
+          <w:sz w:val="22"/>
+          <w:szCs w:val="22"/>
+        </w:rPr>
+      </w:pPr>
+      <w:r>
+        <w:rPr>
+          <w:sz w:val="22"/>
+          <w:szCs w:val="22"/>
+        </w:rPr>
+        <w:t xml:space="preserve">Te quiero </w:t>
+      </w:r>
+      <w:r>
+        <w:rPr>
+          <w:sz w:val="22"/>
+          <w:szCs w:val="22"/>
+        </w:rPr>
+        <w:t>con tus miedos</w:t>
+      </w:r>
+    </w:p>
+    <w:p>
+      <w:pPr>
+        <w:pStyle w:val="NormalWeb"/>
+        <w:spacing w:line="360" w:lineRule="auto"/>
+        <w:rPr>
+          <w:sz w:val="22"/>
+          <w:szCs w:val="22"/>
+        </w:rPr>
+      </w:pPr>
+      <w:r>
+        <w:rPr>
+          <w:sz w:val="22"/>
+          <w:szCs w:val="22"/>
+        </w:rPr>
+        <w:t>Te quiero</w:t>
+      </w:r>
+      <w:r>
+        <w:rPr>
+          <w:sz w:val="22"/>
+          <w:szCs w:val="22"/>
+        </w:rPr>
+        <w:t xml:space="preserve"> tal como eres</w:t>
+      </w:r>
+    </w:p>
+    <w:p>
+      <w:pPr>
+        <w:pStyle w:val="NormalWeb"/>
+        <w:spacing w:line="360" w:lineRule="auto"/>
+        <w:rPr>
+          <w:sz w:val="22"/>
+          <w:szCs w:val="22"/>
+        </w:rPr>
+      </w:pPr>
+      <w:r>
+        <w:rPr>
+          <w:sz w:val="22"/>
+          <w:szCs w:val="22"/>
+        </w:rPr>
+        <w:lastRenderedPageBreak/>
+        <w:t>Te quiero hoy, mañana y siempre</w:t>
+      </w:r>
+    </w:p>
+    <w:p>
+      <w:pPr>
+        <w:pStyle w:val="NormalWeb"/>
+        <w:spacing w:line="360" w:lineRule="auto"/>
+        <w:rPr>
+          <w:sz w:val="22"/>
+          <w:szCs w:val="22"/>
+        </w:rPr>
+      </w:pPr>
+    </w:p>
+    <w:p>
+      <w:pPr>
+        <w:pStyle w:val="NormalWeb"/>
+        <w:spacing w:line="360" w:lineRule="auto"/>
+        <w:rPr>
+          <w:sz w:val="22"/>
+          <w:szCs w:val="22"/>
+        </w:rPr>
+      </w:pPr>
+      <w:r>
+        <w:rPr>
+          <w:sz w:val="22"/>
+          <w:szCs w:val="22"/>
+        </w:rPr>
+        <w:t>Porque el amor se trata de eso</w:t>
+      </w:r>
+    </w:p>
+    <w:p>
+      <w:pPr>
+        <w:pStyle w:val="NormalWeb"/>
+        <w:spacing w:line="360" w:lineRule="auto"/>
+        <w:rPr>
+          <w:sz w:val="22"/>
+          <w:szCs w:val="22"/>
+        </w:rPr>
+      </w:pPr>
+      <w:r>
+        <w:rPr>
+          <w:sz w:val="22"/>
+          <w:szCs w:val="22"/>
+        </w:rPr>
+        <w:t xml:space="preserve">No me </w:t>
+      </w:r>
+      <w:proofErr w:type="spellStart"/>
+      <w:r>
+        <w:rPr>
+          <w:sz w:val="22"/>
+          <w:szCs w:val="22"/>
+        </w:rPr>
+        <w:t>ire</w:t>
+      </w:r>
+      <w:proofErr w:type="spellEnd"/>
+      <w:r>
+        <w:rPr>
+          <w:sz w:val="22"/>
+          <w:szCs w:val="22"/>
+        </w:rPr>
+        <w:t>, luchare por esto</w:t>
+      </w:r>
+    </w:p>
+    <w:p>
+      <w:pPr>
+        <w:pStyle w:val="NormalWeb"/>
+        <w:spacing w:line="360" w:lineRule="auto"/>
+        <w:rPr>
+          <w:sz w:val="22"/>
+          <w:szCs w:val="22"/>
+        </w:rPr>
+      </w:pPr>
+      <w:r>
+        <w:rPr>
+          <w:sz w:val="22"/>
+          <w:szCs w:val="22"/>
+        </w:rPr>
+        <w:t xml:space="preserve">Sabes que eso </w:t>
+      </w:r>
+      <w:r>
+        <w:rPr>
+          <w:sz w:val="22"/>
+          <w:szCs w:val="22"/>
+        </w:rPr>
+        <w:t>no va detenerme</w:t>
+      </w:r>
+    </w:p>
+    <w:p>
+      <w:pPr>
+        <w:pStyle w:val="NormalWeb"/>
+        <w:spacing w:line="360" w:lineRule="auto"/>
+        <w:rPr>
+          <w:sz w:val="22"/>
+          <w:szCs w:val="22"/>
+        </w:rPr>
+      </w:pPr>
+      <w:r>
+        <w:rPr>
+          <w:sz w:val="22"/>
+          <w:szCs w:val="22"/>
+        </w:rPr>
+        <w:t>Te quiero hoy, mañana y siempre</w:t>
+      </w:r>
+    </w:p>
+    <w:p>
+      <w:pPr>
+        <w:pStyle w:val="NormalWeb"/>
+        <w:spacing w:line="360" w:lineRule="auto"/>
+        <w:rPr>
+          <w:sz w:val="22"/>
+          <w:szCs w:val="22"/>
+        </w:rPr>
+      </w:pPr>
+      <w:r>
+        <w:rPr>
+          <w:sz w:val="22"/>
+          <w:szCs w:val="22"/>
+        </w:rPr>
+        <w:t>Te quiero hoy, mañana y siempre</w:t>
+      </w:r>
+    </w:p>
+    <w:p>
+      <w:pPr>
+        <w:pStyle w:val="NormalWeb"/>
+        <w:spacing w:line="360" w:lineRule="auto"/>
+        <w:rPr>
+          <w:sz w:val="22"/>
+          <w:szCs w:val="22"/>
+        </w:rPr>
+      </w:pPr>
+      <w:r>
+        <w:rPr>
+          <w:sz w:val="22"/>
+          <w:szCs w:val="22"/>
+        </w:rPr>
+        <w:t>Fin de coro</w:t>
+      </w:r>
+    </w:p>
+    <w:p>
+      <w:pPr>
+        <w:pStyle w:val="NormalWeb"/>
+        <w:spacing w:line="360" w:lineRule="auto"/>
+        <w:rPr>
+          <w:sz w:val="22"/>
+          <w:szCs w:val="22"/>
+        </w:rPr>
+      </w:pPr>
+    </w:p>
+    <w:p>
+      <w:pPr>
+        <w:pStyle w:val="NormalWeb"/>
+        <w:spacing w:line="360" w:lineRule="auto"/>
+        <w:rPr>
+          <w:sz w:val="22"/>
+          <w:szCs w:val="22"/>
+        </w:rPr>
+      </w:pPr>
+      <w:r>
+        <w:rPr>
+          <w:sz w:val="22"/>
+          <w:szCs w:val="22"/>
+        </w:rPr>
+        <w:t>Te elijo a ti por aquello que me diste</w:t>
+      </w:r>
+    </w:p>
+    <w:p>
+      <w:pPr>
+        <w:pStyle w:val="NormalWeb"/>
+        <w:spacing w:line="360" w:lineRule="auto"/>
+        <w:rPr>
+          <w:sz w:val="22"/>
+          <w:szCs w:val="22"/>
+        </w:rPr>
+      </w:pPr>
+      <w:r>
+        <w:rPr>
+          <w:sz w:val="22"/>
+          <w:szCs w:val="22"/>
+        </w:rPr>
+        <w:t>Porque alegraste este corazón triste</w:t>
+      </w:r>
+    </w:p>
+    <w:p>
+      <w:pPr>
+        <w:pStyle w:val="NormalWeb"/>
+        <w:spacing w:line="360" w:lineRule="auto"/>
+        <w:rPr>
+          <w:sz w:val="22"/>
+          <w:szCs w:val="22"/>
+        </w:rPr>
+      </w:pPr>
+      <w:r>
+        <w:rPr>
+          <w:sz w:val="22"/>
+          <w:szCs w:val="22"/>
+        </w:rPr>
+        <w:t xml:space="preserve">Debo confesar, me enamoro </w:t>
+      </w:r>
+      <w:r>
+        <w:rPr>
+          <w:sz w:val="22"/>
+          <w:szCs w:val="22"/>
+        </w:rPr>
+        <w:t xml:space="preserve">cada vez </w:t>
+      </w:r>
+      <w:r>
+        <w:rPr>
+          <w:sz w:val="22"/>
+          <w:szCs w:val="22"/>
+        </w:rPr>
+        <w:t>mas</w:t>
+      </w:r>
+    </w:p>
+    <w:p>
+      <w:pPr>
+        <w:pStyle w:val="NormalWeb"/>
+        <w:spacing w:line="360" w:lineRule="auto"/>
+        <w:rPr>
+          <w:sz w:val="22"/>
+          <w:szCs w:val="22"/>
+        </w:rPr>
+      </w:pPr>
+      <w:r>
+        <w:rPr>
+          <w:sz w:val="22"/>
+          <w:szCs w:val="22"/>
+        </w:rPr>
+        <w:t>Con cada cosa</w:t>
+      </w:r>
+      <w:r>
+        <w:rPr>
+          <w:sz w:val="22"/>
+          <w:szCs w:val="22"/>
+        </w:rPr>
+        <w:t xml:space="preserve"> que dices</w:t>
+      </w:r>
+      <w:r>
+        <w:rPr>
+          <w:sz w:val="22"/>
+          <w:szCs w:val="22"/>
+        </w:rPr>
+        <w:t xml:space="preserve"> que </w:t>
+      </w:r>
+      <w:r>
+        <w:rPr>
+          <w:sz w:val="22"/>
+          <w:szCs w:val="22"/>
+        </w:rPr>
+        <w:t>de ti está</w:t>
+      </w:r>
+      <w:r>
+        <w:rPr>
+          <w:sz w:val="22"/>
+          <w:szCs w:val="22"/>
+        </w:rPr>
+        <w:t xml:space="preserve"> mal</w:t>
+      </w:r>
+    </w:p>
+    <w:p>
+      <w:pPr>
+        <w:pStyle w:val="NormalWeb"/>
+        <w:spacing w:line="360" w:lineRule="auto"/>
+        <w:rPr>
+          <w:sz w:val="22"/>
+          <w:szCs w:val="22"/>
+        </w:rPr>
+      </w:pPr>
+    </w:p>
+    <w:p>
+      <w:pPr>
+        <w:pStyle w:val="NormalWeb"/>
+        <w:spacing w:line="360" w:lineRule="auto"/>
+        <w:rPr>
+          <w:sz w:val="22"/>
+          <w:szCs w:val="22"/>
+        </w:rPr>
+      </w:pPr>
+      <w:r>
+        <w:rPr>
+          <w:sz w:val="22"/>
+          <w:szCs w:val="22"/>
+        </w:rPr>
+        <w:t>Por que te hace humano, Aquello</w:t>
+      </w:r>
+      <w:r>
+        <w:rPr>
+          <w:sz w:val="22"/>
+          <w:szCs w:val="22"/>
+        </w:rPr>
+        <w:t xml:space="preserve"> que</w:t>
+      </w:r>
+      <w:r>
+        <w:rPr>
+          <w:sz w:val="22"/>
+          <w:szCs w:val="22"/>
+        </w:rPr>
+        <w:t xml:space="preserve"> duele</w:t>
+      </w:r>
+    </w:p>
+    <w:p>
+      <w:pPr>
+        <w:pStyle w:val="NormalWeb"/>
+        <w:spacing w:line="360" w:lineRule="auto"/>
+        <w:rPr>
+          <w:sz w:val="22"/>
+          <w:szCs w:val="22"/>
+        </w:rPr>
+      </w:pPr>
+      <w:r>
+        <w:rPr>
+          <w:sz w:val="22"/>
+          <w:szCs w:val="22"/>
+        </w:rPr>
+        <w:t>Yo no soy p</w:t>
+      </w:r>
+      <w:r>
+        <w:rPr>
+          <w:sz w:val="22"/>
+          <w:szCs w:val="22"/>
+        </w:rPr>
+        <w:t>erfecto, tengo errores</w:t>
+      </w:r>
+    </w:p>
+    <w:p>
+      <w:pPr>
+        <w:pStyle w:val="NormalWeb"/>
+        <w:spacing w:line="360" w:lineRule="auto"/>
+        <w:rPr>
+          <w:sz w:val="22"/>
+          <w:szCs w:val="22"/>
+        </w:rPr>
+      </w:pPr>
+      <w:r>
+        <w:rPr>
+          <w:sz w:val="22"/>
+          <w:szCs w:val="22"/>
+        </w:rPr>
+        <w:t>Se que nos queremos, es suficiente</w:t>
+      </w:r>
+    </w:p>
+    <w:p>
+      <w:pPr>
+        <w:pStyle w:val="NormalWeb"/>
+        <w:spacing w:line="360" w:lineRule="auto"/>
+        <w:rPr>
+          <w:sz w:val="22"/>
+          <w:szCs w:val="22"/>
+        </w:rPr>
+      </w:pPr>
+      <w:r>
+        <w:rPr>
+          <w:sz w:val="22"/>
+          <w:szCs w:val="22"/>
+        </w:rPr>
+        <w:t>A veces las cosas imperfectas, son las mejores</w:t>
+      </w:r>
+    </w:p>
+    <w:p>
+      <w:pPr>
+        <w:pStyle w:val="NormalWeb"/>
+        <w:spacing w:line="360" w:lineRule="auto"/>
+        <w:rPr>
+          <w:sz w:val="22"/>
+          <w:szCs w:val="22"/>
+        </w:rPr>
+      </w:pPr>
+      <w:proofErr w:type="spellStart"/>
+      <w:r>
+        <w:rPr>
+          <w:sz w:val="22"/>
+          <w:szCs w:val="22"/>
+        </w:rPr>
+        <w:t>Precoro</w:t>
+      </w:r>
+      <w:proofErr w:type="spellEnd"/>
+      <w:r>
+        <w:rPr>
+          <w:sz w:val="22"/>
+          <w:szCs w:val="22"/>
+        </w:rPr>
+        <w:t>**</w:t>
+      </w:r>
+    </w:p>
+    <w:p>
+      <w:pPr>
+        <w:pStyle w:val="NormalWeb"/>
+        <w:spacing w:line="360" w:lineRule="auto"/>
+        <w:rPr>
+          <w:sz w:val="22"/>
+          <w:szCs w:val="22"/>
+        </w:rPr>
+      </w:pPr>
+      <w:r>
+        <w:rPr>
+          <w:sz w:val="22"/>
+          <w:szCs w:val="22"/>
+        </w:rPr>
+        <w:t xml:space="preserve">Una vida dura te toco enfrentar, lo se </w:t>
+      </w:r>
+    </w:p>
+    <w:p>
+      <w:pPr>
+        <w:pStyle w:val="NormalWeb"/>
+        <w:spacing w:line="360" w:lineRule="auto"/>
+        <w:rPr>
+          <w:sz w:val="22"/>
+          <w:szCs w:val="22"/>
+        </w:rPr>
+      </w:pPr>
+      <w:r>
+        <w:rPr>
+          <w:sz w:val="22"/>
+          <w:szCs w:val="22"/>
+        </w:rPr>
+        <w:t xml:space="preserve">A cualquiera le pudo pasar, a </w:t>
+      </w:r>
+      <w:proofErr w:type="spellStart"/>
+      <w:r>
+        <w:rPr>
+          <w:sz w:val="22"/>
+          <w:szCs w:val="22"/>
+        </w:rPr>
+        <w:t>mi</w:t>
+      </w:r>
+      <w:proofErr w:type="spellEnd"/>
+      <w:r>
+        <w:rPr>
+          <w:sz w:val="22"/>
+          <w:szCs w:val="22"/>
+        </w:rPr>
+        <w:t xml:space="preserve"> me paso</w:t>
+      </w:r>
+    </w:p>
+    <w:p>
+      <w:pPr>
+        <w:pStyle w:val="NormalWeb"/>
+        <w:spacing w:line="360" w:lineRule="auto"/>
+        <w:rPr>
+          <w:sz w:val="22"/>
+          <w:szCs w:val="22"/>
+        </w:rPr>
+      </w:pPr>
+      <w:r>
+        <w:rPr>
+          <w:sz w:val="22"/>
+          <w:szCs w:val="22"/>
+        </w:rPr>
+        <w:lastRenderedPageBreak/>
+        <w:t>Estando solo, fue lo peor</w:t>
+      </w:r>
+    </w:p>
+    <w:p>
+      <w:pPr>
+        <w:pStyle w:val="NormalWeb"/>
+        <w:spacing w:line="360" w:lineRule="auto"/>
+        <w:rPr>
+          <w:sz w:val="22"/>
+          <w:szCs w:val="22"/>
+        </w:rPr>
+      </w:pPr>
+      <w:r>
+        <w:rPr>
+          <w:sz w:val="22"/>
+          <w:szCs w:val="22"/>
+        </w:rPr>
+        <w:t>¿Enserio crees que te dejare?</w:t>
+      </w:r>
+    </w:p>
+    <w:p>
+      <w:pPr>
+        <w:pStyle w:val="NormalWeb"/>
+        <w:spacing w:line="360" w:lineRule="auto"/>
+        <w:rPr>
+          <w:sz w:val="22"/>
+          <w:szCs w:val="22"/>
+        </w:rPr>
+      </w:pPr>
+      <w:r>
+        <w:rPr>
+          <w:sz w:val="22"/>
+          <w:szCs w:val="22"/>
+        </w:rPr>
+        <w:t>Coro**</w:t>
+      </w:r>
+    </w:p>
+    <w:p>
+      <w:pPr>
+        <w:pStyle w:val="NormalWeb"/>
+        <w:spacing w:line="360" w:lineRule="auto"/>
+        <w:rPr>
+          <w:sz w:val="22"/>
+          <w:szCs w:val="22"/>
+        </w:rPr>
+      </w:pPr>
+      <w:r>
+        <w:rPr>
+          <w:sz w:val="22"/>
+          <w:szCs w:val="22"/>
+        </w:rPr>
+        <w:t>Te quiero, aunque estes lejos</w:t>
+      </w:r>
+    </w:p>
+    <w:p>
+      <w:pPr>
+        <w:pStyle w:val="NormalWeb"/>
+        <w:spacing w:line="360" w:lineRule="auto"/>
+        <w:rPr>
+          <w:sz w:val="22"/>
+          <w:szCs w:val="22"/>
+        </w:rPr>
+      </w:pPr>
+      <w:r>
+        <w:rPr>
+          <w:sz w:val="22"/>
+          <w:szCs w:val="22"/>
+        </w:rPr>
+        <w:t>Te quiero con tus miedos</w:t>
+      </w:r>
+    </w:p>
+    <w:p>
+      <w:pPr>
+        <w:pStyle w:val="NormalWeb"/>
+        <w:spacing w:line="360" w:lineRule="auto"/>
+        <w:rPr>
+          <w:sz w:val="22"/>
+          <w:szCs w:val="22"/>
+        </w:rPr>
+      </w:pPr>
+      <w:r>
+        <w:rPr>
+          <w:sz w:val="22"/>
+          <w:szCs w:val="22"/>
+        </w:rPr>
+        <w:t>Te quiero tal como eres</w:t>
+      </w:r>
+    </w:p>
+    <w:p>
+      <w:pPr>
+        <w:pStyle w:val="NormalWeb"/>
+        <w:spacing w:line="360" w:lineRule="auto"/>
+        <w:rPr>
+          <w:sz w:val="22"/>
+          <w:szCs w:val="22"/>
+        </w:rPr>
+      </w:pPr>
+      <w:r>
+        <w:rPr>
+          <w:sz w:val="22"/>
+          <w:szCs w:val="22"/>
+        </w:rPr>
+        <w:t>Te quiero hoy, mañana y siempre</w:t>
+      </w:r>
+    </w:p>
+    <w:p>
+      <w:pPr>
+        <w:pStyle w:val="NormalWeb"/>
+        <w:spacing w:line="360" w:lineRule="auto"/>
+        <w:rPr>
+          <w:sz w:val="22"/>
+          <w:szCs w:val="22"/>
+        </w:rPr>
+      </w:pPr>
+    </w:p>
+    <w:p>
+      <w:pPr>
+        <w:pStyle w:val="NormalWeb"/>
+        <w:spacing w:line="360" w:lineRule="auto"/>
+        <w:rPr>
+          <w:sz w:val="22"/>
+          <w:szCs w:val="22"/>
+        </w:rPr>
+      </w:pPr>
+      <w:r>
+        <w:rPr>
+          <w:sz w:val="22"/>
+          <w:szCs w:val="22"/>
+        </w:rPr>
+        <w:t>Porque el amor se trata de eso</w:t>
+      </w:r>
+    </w:p>
+    <w:p>
+      <w:pPr>
+        <w:pStyle w:val="NormalWeb"/>
+        <w:spacing w:line="360" w:lineRule="auto"/>
+        <w:rPr>
+          <w:sz w:val="22"/>
+          <w:szCs w:val="22"/>
+        </w:rPr>
+      </w:pPr>
+      <w:r>
+        <w:rPr>
+          <w:sz w:val="22"/>
+          <w:szCs w:val="22"/>
+        </w:rPr>
+        <w:t xml:space="preserve">No me </w:t>
+      </w:r>
+      <w:proofErr w:type="spellStart"/>
+      <w:r>
+        <w:rPr>
+          <w:sz w:val="22"/>
+          <w:szCs w:val="22"/>
+        </w:rPr>
+        <w:t>ire</w:t>
+      </w:r>
+      <w:proofErr w:type="spellEnd"/>
+      <w:r>
+        <w:rPr>
+          <w:sz w:val="22"/>
+          <w:szCs w:val="22"/>
+        </w:rPr>
+        <w:t>, luchare por esto</w:t>
+      </w:r>
+    </w:p>
+    <w:p>
+      <w:pPr>
+        <w:pStyle w:val="NormalWeb"/>
+        <w:spacing w:line="360" w:lineRule="auto"/>
+        <w:rPr>
+          <w:sz w:val="22"/>
+          <w:szCs w:val="22"/>
+        </w:rPr>
+      </w:pPr>
+      <w:r>
+        <w:rPr>
+          <w:sz w:val="22"/>
+          <w:szCs w:val="22"/>
+        </w:rPr>
+        <w:t>Sabes que eso no va detenerme</w:t>
+      </w:r>
+    </w:p>
+    <w:p>
+      <w:pPr>
+        <w:pStyle w:val="NormalWeb"/>
+        <w:spacing w:line="360" w:lineRule="auto"/>
+        <w:rPr>
+          <w:sz w:val="22"/>
+          <w:szCs w:val="22"/>
+        </w:rPr>
+      </w:pPr>
+      <w:r>
+        <w:rPr>
+          <w:sz w:val="22"/>
+          <w:szCs w:val="22"/>
+        </w:rPr>
+        <w:t>Te quiero hoy, mañana y siempre</w:t>
+      </w:r>
+    </w:p>
+    <w:p>
+      <w:pPr>
+        <w:pStyle w:val="NormalWeb"/>
+        <w:spacing w:line="360" w:lineRule="auto"/>
+        <w:rPr>
+          <w:sz w:val="22"/>
+          <w:szCs w:val="22"/>
+        </w:rPr>
+      </w:pPr>
+    </w:p>
+    <w:p>
+      <w:pPr>
+        <w:pStyle w:val="NormalWeb"/>
+        <w:spacing w:line="360" w:lineRule="auto"/>
+        <w:rPr>
+          <w:sz w:val="22"/>
+          <w:szCs w:val="22"/>
+        </w:rPr>
+      </w:pPr>
+      <w:r>
+        <w:rPr>
+          <w:sz w:val="22"/>
+          <w:szCs w:val="22"/>
+        </w:rPr>
+        <w:t xml:space="preserve">Te quiero hoy, mañana y </w:t>
+      </w:r>
+      <w:proofErr w:type="spellStart"/>
+      <w:r>
+        <w:rPr>
+          <w:sz w:val="22"/>
+          <w:szCs w:val="22"/>
+        </w:rPr>
+        <w:t>siempre</w:t>
+      </w:r>
+      <w:r>
+        <w:rPr>
+          <w:sz w:val="22"/>
+          <w:szCs w:val="22"/>
+        </w:rPr>
+        <w:t>eee</w:t>
+      </w:r>
+      <w:proofErr w:type="spellEnd"/>
+    </w:p>
+    <w:p>
+      <w:pPr>
+        <w:pStyle w:val="NormalWeb"/>
+        <w:spacing w:line="360" w:lineRule="auto"/>
+        <w:rPr>
+          <w:sz w:val="22"/>
+          <w:szCs w:val="22"/>
+        </w:rPr>
+      </w:pPr>
+      <w:r>
+        <w:rPr>
+          <w:sz w:val="22"/>
+          <w:szCs w:val="22"/>
+        </w:rPr>
+        <w:t>Fin de coro</w:t>
+      </w:r>
+    </w:p>
+    <w:p>
+      <w:pPr>
+        <w:pStyle w:val="NormalWeb"/>
+        <w:spacing w:line="360" w:lineRule="auto"/>
+        <w:rPr>
+          <w:sz w:val="22"/>
+          <w:szCs w:val="22"/>
+        </w:rPr>
+      </w:pPr>
+    </w:p>
+    <w:p>
+      <w:pPr>
+        <w:pStyle w:val="NormalWeb"/>
+        <w:spacing w:line="360" w:lineRule="auto"/>
+        <w:rPr>
+          <w:sz w:val="22"/>
+          <w:szCs w:val="22"/>
+        </w:rPr>
+      </w:pPr>
+      <w:r>
+        <w:rPr>
+          <w:sz w:val="22"/>
+          <w:szCs w:val="22"/>
+        </w:rPr>
+        <w:t>Si hubiera un contrato</w:t>
+      </w:r>
+    </w:p>
+    <w:p>
+      <w:pPr>
+        <w:pStyle w:val="NormalWeb"/>
+        <w:spacing w:line="360" w:lineRule="auto"/>
+        <w:rPr>
+          <w:sz w:val="22"/>
+          <w:szCs w:val="22"/>
+        </w:rPr>
+      </w:pPr>
+      <w:r>
+        <w:rPr>
+          <w:sz w:val="22"/>
+          <w:szCs w:val="22"/>
+        </w:rPr>
+        <w:t>Donde esta que lo firmo</w:t>
+      </w:r>
+    </w:p>
+    <w:p>
+      <w:pPr>
+        <w:pStyle w:val="NormalWeb"/>
+        <w:spacing w:line="360" w:lineRule="auto"/>
+        <w:rPr>
+          <w:sz w:val="22"/>
+          <w:szCs w:val="22"/>
+        </w:rPr>
+      </w:pPr>
+      <w:r>
+        <w:rPr>
+          <w:sz w:val="22"/>
+          <w:szCs w:val="22"/>
+        </w:rPr>
+        <w:t>Para quedarme a tu lado</w:t>
+      </w:r>
+    </w:p>
+    <w:p>
+      <w:pPr>
+        <w:pStyle w:val="NormalWeb"/>
+        <w:spacing w:line="360" w:lineRule="auto"/>
+        <w:rPr>
+          <w:sz w:val="22"/>
+          <w:szCs w:val="22"/>
+        </w:rPr>
+      </w:pPr>
+      <w:r>
+        <w:rPr>
+          <w:sz w:val="22"/>
+          <w:szCs w:val="22"/>
+        </w:rPr>
+        <w:t>Juntos este viaje, hay que vivirlo</w:t>
+      </w:r>
+    </w:p>
+    <w:p>
+      <w:pPr>
+        <w:pStyle w:val="NormalWeb"/>
+        <w:spacing w:line="360" w:lineRule="auto"/>
+        <w:rPr>
+          <w:sz w:val="22"/>
+          <w:szCs w:val="22"/>
+        </w:rPr>
+      </w:pPr>
+    </w:p>
+    <w:p>
+      <w:pPr>
+        <w:pStyle w:val="NormalWeb"/>
+        <w:spacing w:line="360" w:lineRule="auto"/>
+        <w:rPr>
+          <w:sz w:val="22"/>
+          <w:szCs w:val="22"/>
+        </w:rPr>
+      </w:pPr>
+      <w:proofErr w:type="spellStart"/>
+      <w:r>
+        <w:rPr>
+          <w:sz w:val="22"/>
+          <w:szCs w:val="22"/>
+        </w:rPr>
+        <w:lastRenderedPageBreak/>
+        <w:t>Outro</w:t>
+      </w:r>
+      <w:proofErr w:type="spellEnd"/>
+    </w:p>
+    <w:p>
+      <w:pPr>
+        <w:pStyle w:val="NormalWeb"/>
+        <w:spacing w:line="360" w:lineRule="auto"/>
+        <w:rPr>
+          <w:sz w:val="22"/>
+          <w:szCs w:val="22"/>
+        </w:rPr>
+      </w:pPr>
+      <w:r>
+        <w:rPr>
+          <w:sz w:val="22"/>
+          <w:szCs w:val="22"/>
+        </w:rPr>
+        <w:t>Si hubiera opciones para salir</w:t>
+      </w:r>
+    </w:p>
+    <w:p>
+      <w:pPr>
+        <w:pStyle w:val="NormalWeb"/>
+        <w:spacing w:line="360" w:lineRule="auto"/>
+        <w:rPr>
+          <w:sz w:val="22"/>
+          <w:szCs w:val="22"/>
+        </w:rPr>
+      </w:pPr>
+      <w:r>
+        <w:rPr>
+          <w:sz w:val="22"/>
+          <w:szCs w:val="22"/>
+        </w:rPr>
+        <w:t>Me quedaría contigo en cama, te elijo a ti</w:t>
+      </w:r>
+    </w:p>
+    <w:p>
+      <w:pPr>
+        <w:pStyle w:val="NormalWeb"/>
+        <w:spacing w:line="360" w:lineRule="auto"/>
+        <w:rPr>
+          <w:sz w:val="22"/>
+          <w:szCs w:val="22"/>
+        </w:rPr>
+      </w:pPr>
+      <w:r>
+        <w:rPr>
+          <w:sz w:val="22"/>
+          <w:szCs w:val="22"/>
+        </w:rPr>
+        <w:t>Te quiero tal como eres</w:t>
+      </w:r>
+    </w:p>
+    <w:p>
+      <w:pPr>
+        <w:pStyle w:val="NormalWeb"/>
+        <w:spacing w:line="360" w:lineRule="auto"/>
+        <w:rPr>
+          <w:sz w:val="22"/>
+          <w:szCs w:val="22"/>
+        </w:rPr>
+      </w:pPr>
+      <w:r>
+        <w:rPr>
+          <w:sz w:val="22"/>
+          <w:szCs w:val="22"/>
+        </w:rPr>
+        <w:t>Te quiero hoy, mañana y siempre</w:t>
+      </w:r>
+    </w:p>
+    <w:p>
+      <w:pPr>
+        <w:pStyle w:val="NormalWeb"/>
+        <w:spacing w:line="360" w:lineRule="auto"/>
+        <w:rPr>
+          <w:sz w:val="22"/>
+          <w:szCs w:val="22"/>
+        </w:rPr>
+      </w:pPr>
+      <w:r>
+        <w:rPr>
+          <w:sz w:val="22"/>
+          <w:szCs w:val="22"/>
+        </w:rPr>
+        <w:t xml:space="preserve"> </w:t>
+      </w:r>
+    </w:p>
+    <w:p>
+      <w:pPr>
+        <w:pStyle w:val="NormalWeb"/>
+        <w:spacing w:line="360" w:lineRule="auto"/>
+        <w:rPr>
+          <w:b/>
+          <w:bCs/>
+          <w:sz w:val="22"/>
+          <w:szCs w:val="22"/>
+        </w:rPr>
+      </w:pPr>
+      <w:r>
+        <w:rPr>
+          <w:b/>
+          <w:bCs/>
+          <w:sz w:val="22"/>
+          <w:szCs w:val="22"/>
+        </w:rPr>
+        <w:t>SOULMATE</w:t>
+      </w:r>
+    </w:p>
+    <w:p>
+      <w:pPr>
+        <w:pStyle w:val="NormalWeb"/>
+        <w:spacing w:line="360" w:lineRule="auto"/>
+        <w:rPr>
+          <w:sz w:val="22"/>
+          <w:szCs w:val="22"/>
+        </w:rPr>
+      </w:pPr>
+      <w:r>
+        <w:rPr>
+          <w:sz w:val="22"/>
+          <w:szCs w:val="22"/>
+        </w:rPr>
+        <w:t>Sabes</w:t>
+      </w:r>
+      <w:r>
+        <w:rPr>
+          <w:sz w:val="22"/>
+          <w:szCs w:val="22"/>
+        </w:rPr>
+        <w:t xml:space="preserve"> que no me detendré</w:t>
+      </w:r>
+    </w:p>
+    <w:p>
+      <w:pPr>
+        <w:pStyle w:val="NormalWeb"/>
+        <w:spacing w:line="360" w:lineRule="auto"/>
+        <w:rPr>
+          <w:sz w:val="22"/>
+          <w:szCs w:val="22"/>
+        </w:rPr>
+      </w:pPr>
+      <w:r>
+        <w:rPr>
+          <w:sz w:val="22"/>
+          <w:szCs w:val="22"/>
+        </w:rPr>
+        <w:t>Esto si se siente muy bien</w:t>
+      </w:r>
+    </w:p>
+    <w:p>
+      <w:pPr>
+        <w:pStyle w:val="NormalWeb"/>
+        <w:spacing w:line="360" w:lineRule="auto"/>
+        <w:rPr>
+          <w:sz w:val="22"/>
+          <w:szCs w:val="22"/>
+        </w:rPr>
+      </w:pPr>
+      <w:r>
+        <w:rPr>
+          <w:sz w:val="22"/>
+          <w:szCs w:val="22"/>
+        </w:rPr>
+        <w:t xml:space="preserve">Sentado </w:t>
+      </w:r>
+      <w:r>
+        <w:rPr>
+          <w:sz w:val="22"/>
+          <w:szCs w:val="22"/>
+        </w:rPr>
+        <w:t>el filo</w:t>
+      </w:r>
+      <w:r>
+        <w:rPr>
+          <w:sz w:val="22"/>
+          <w:szCs w:val="22"/>
+        </w:rPr>
+        <w:t>, esperando ver la noche caer</w:t>
+      </w:r>
+    </w:p>
+    <w:p>
+      <w:pPr>
+        <w:pStyle w:val="NormalWeb"/>
+        <w:spacing w:line="360" w:lineRule="auto"/>
+        <w:rPr>
+          <w:sz w:val="22"/>
+          <w:szCs w:val="22"/>
+        </w:rPr>
+      </w:pPr>
+      <w:r>
+        <w:rPr>
+          <w:sz w:val="22"/>
+          <w:szCs w:val="22"/>
+        </w:rPr>
+        <w:t xml:space="preserve">Eres </w:t>
+      </w:r>
+      <w:r>
+        <w:rPr>
+          <w:sz w:val="22"/>
+          <w:szCs w:val="22"/>
+        </w:rPr>
+        <w:t xml:space="preserve">algo </w:t>
+      </w:r>
+      <w:r>
+        <w:rPr>
+          <w:sz w:val="22"/>
+          <w:szCs w:val="22"/>
+        </w:rPr>
+        <w:t>químico que</w:t>
+      </w:r>
+      <w:r>
+        <w:rPr>
+          <w:sz w:val="22"/>
+          <w:szCs w:val="22"/>
+        </w:rPr>
+        <w:t xml:space="preserve"> no puedo</w:t>
+      </w:r>
+      <w:r>
+        <w:rPr>
+          <w:sz w:val="22"/>
+          <w:szCs w:val="22"/>
+        </w:rPr>
+        <w:t xml:space="preserve"> entender</w:t>
+      </w:r>
+    </w:p>
+    <w:p>
+      <w:pPr>
+        <w:pStyle w:val="NormalWeb"/>
+        <w:spacing w:line="360" w:lineRule="auto"/>
+        <w:rPr>
+          <w:sz w:val="22"/>
+          <w:szCs w:val="22"/>
+        </w:rPr>
+      </w:pPr>
+    </w:p>
+    <w:p>
+      <w:pPr>
+        <w:pStyle w:val="NormalWeb"/>
+        <w:spacing w:line="360" w:lineRule="auto"/>
+        <w:rPr>
+          <w:sz w:val="22"/>
+          <w:szCs w:val="22"/>
+        </w:rPr>
+      </w:pPr>
+      <w:proofErr w:type="spellStart"/>
+      <w:r>
+        <w:rPr>
+          <w:sz w:val="22"/>
+          <w:szCs w:val="22"/>
+        </w:rPr>
+        <w:t>Prechorus</w:t>
+      </w:r>
+      <w:proofErr w:type="spellEnd"/>
+    </w:p>
+    <w:p>
+      <w:pPr>
+        <w:pStyle w:val="NormalWeb"/>
+        <w:spacing w:line="360" w:lineRule="auto"/>
+        <w:rPr>
+          <w:sz w:val="22"/>
+          <w:szCs w:val="22"/>
+        </w:rPr>
+      </w:pPr>
+      <w:r>
+        <w:rPr>
+          <w:sz w:val="22"/>
+          <w:szCs w:val="22"/>
+        </w:rPr>
+        <w:t>Mi mejor versión es para ti</w:t>
+      </w:r>
+    </w:p>
+    <w:p>
+      <w:pPr>
+        <w:pStyle w:val="NormalWeb"/>
+        <w:spacing w:line="360" w:lineRule="auto"/>
+        <w:rPr>
+          <w:sz w:val="22"/>
+          <w:szCs w:val="22"/>
+        </w:rPr>
+      </w:pPr>
+      <w:r>
+        <w:rPr>
+          <w:sz w:val="22"/>
+          <w:szCs w:val="22"/>
+        </w:rPr>
+        <w:t xml:space="preserve">Un amor de </w:t>
+      </w:r>
+      <w:proofErr w:type="gramStart"/>
+      <w:r>
+        <w:rPr>
+          <w:sz w:val="22"/>
+          <w:szCs w:val="22"/>
+        </w:rPr>
+        <w:t xml:space="preserve">besos </w:t>
+      </w:r>
+      <w:r>
+        <w:rPr>
+          <w:sz w:val="22"/>
+          <w:szCs w:val="22"/>
+        </w:rPr>
+        <w:t xml:space="preserve"> sin</w:t>
+      </w:r>
+      <w:proofErr w:type="gramEnd"/>
+      <w:r>
+        <w:rPr>
+          <w:sz w:val="22"/>
+          <w:szCs w:val="22"/>
+        </w:rPr>
+        <w:t xml:space="preserve"> fin</w:t>
+      </w:r>
+    </w:p>
+    <w:p>
+      <w:pPr>
+        <w:pStyle w:val="NormalWeb"/>
+        <w:spacing w:line="360" w:lineRule="auto"/>
+        <w:rPr>
+          <w:sz w:val="22"/>
+          <w:szCs w:val="22"/>
+        </w:rPr>
+      </w:pPr>
+      <w:proofErr w:type="spellStart"/>
+      <w:r>
+        <w:rPr>
+          <w:sz w:val="22"/>
+          <w:szCs w:val="22"/>
+        </w:rPr>
+        <w:t>Jamas</w:t>
+      </w:r>
+      <w:proofErr w:type="spellEnd"/>
+      <w:r>
+        <w:rPr>
+          <w:sz w:val="22"/>
+          <w:szCs w:val="22"/>
+        </w:rPr>
+        <w:t xml:space="preserve"> fui tan cursi por alguien</w:t>
+      </w:r>
+    </w:p>
+    <w:p>
+      <w:pPr>
+        <w:pStyle w:val="NormalWeb"/>
+        <w:spacing w:line="360" w:lineRule="auto"/>
+        <w:rPr>
+          <w:sz w:val="22"/>
+          <w:szCs w:val="22"/>
+        </w:rPr>
+      </w:pPr>
+      <w:r>
+        <w:rPr>
+          <w:sz w:val="22"/>
+          <w:szCs w:val="22"/>
+        </w:rPr>
+        <w:t>Pero no soy el de antes, voy a amarte</w:t>
+      </w:r>
+    </w:p>
+    <w:p>
+      <w:pPr>
+        <w:pStyle w:val="NormalWeb"/>
+        <w:spacing w:line="360" w:lineRule="auto"/>
+        <w:rPr>
+          <w:sz w:val="22"/>
+          <w:szCs w:val="22"/>
+        </w:rPr>
+      </w:pPr>
+    </w:p>
+    <w:p>
+      <w:pPr>
+        <w:pStyle w:val="NormalWeb"/>
+        <w:spacing w:line="360" w:lineRule="auto"/>
+        <w:rPr>
+          <w:sz w:val="22"/>
+          <w:szCs w:val="22"/>
+        </w:rPr>
+      </w:pPr>
+      <w:r>
+        <w:rPr>
+          <w:sz w:val="22"/>
+          <w:szCs w:val="22"/>
+        </w:rPr>
+        <w:t>Choros</w:t>
+      </w:r>
+    </w:p>
+    <w:p>
+      <w:pPr>
+        <w:pStyle w:val="NormalWeb"/>
+        <w:spacing w:line="360" w:lineRule="auto"/>
+        <w:rPr>
+          <w:sz w:val="22"/>
+          <w:szCs w:val="22"/>
+        </w:rPr>
+      </w:pPr>
+      <w:r>
+        <w:rPr>
+          <w:sz w:val="22"/>
+          <w:szCs w:val="22"/>
+        </w:rPr>
+        <w:t xml:space="preserve">Sabes que ahora lo se muy bien </w:t>
+      </w:r>
+    </w:p>
+    <w:p>
+      <w:pPr>
+        <w:pStyle w:val="NormalWeb"/>
+        <w:spacing w:line="360" w:lineRule="auto"/>
+        <w:rPr>
+          <w:sz w:val="22"/>
+          <w:szCs w:val="22"/>
+        </w:rPr>
+      </w:pPr>
+      <w:r>
+        <w:rPr>
+          <w:sz w:val="22"/>
+          <w:szCs w:val="22"/>
+        </w:rPr>
+        <w:t>Todo que lo que contaste, lo recordé</w:t>
+      </w:r>
+    </w:p>
+    <w:p>
+      <w:pPr>
+        <w:pStyle w:val="NormalWeb"/>
+        <w:spacing w:line="360" w:lineRule="auto"/>
+        <w:rPr>
+          <w:sz w:val="22"/>
+          <w:szCs w:val="22"/>
+        </w:rPr>
+      </w:pPr>
+      <w:r>
+        <w:rPr>
+          <w:sz w:val="22"/>
+          <w:szCs w:val="22"/>
+        </w:rPr>
+        <w:lastRenderedPageBreak/>
+        <w:t xml:space="preserve">Eres importante </w:t>
+      </w:r>
+      <w:proofErr w:type="spellStart"/>
+      <w:r>
+        <w:rPr>
+          <w:sz w:val="22"/>
+          <w:szCs w:val="22"/>
+        </w:rPr>
+        <w:t>asi</w:t>
+      </w:r>
+      <w:proofErr w:type="spellEnd"/>
+      <w:r>
+        <w:rPr>
+          <w:sz w:val="22"/>
+          <w:szCs w:val="22"/>
+        </w:rPr>
+        <w:t xml:space="preserve"> que lo tengo en mi</w:t>
+      </w:r>
+    </w:p>
+    <w:p>
+      <w:pPr>
+        <w:pStyle w:val="NormalWeb"/>
+        <w:spacing w:line="360" w:lineRule="auto"/>
+        <w:rPr>
+          <w:sz w:val="22"/>
+          <w:szCs w:val="22"/>
+        </w:rPr>
+      </w:pPr>
+      <w:r>
+        <w:rPr>
+          <w:sz w:val="22"/>
+          <w:szCs w:val="22"/>
+        </w:rPr>
+        <w:t xml:space="preserve">Una carta de amor, de mi para ti </w:t>
+      </w:r>
+    </w:p>
+    <w:p>
+      <w:pPr>
+        <w:pStyle w:val="NormalWeb"/>
+        <w:spacing w:line="360" w:lineRule="auto"/>
+        <w:rPr>
+          <w:sz w:val="22"/>
+          <w:szCs w:val="22"/>
+        </w:rPr>
+      </w:pPr>
+    </w:p>
+    <w:p>
+      <w:pPr>
+        <w:pStyle w:val="NormalWeb"/>
+        <w:spacing w:line="360" w:lineRule="auto"/>
+        <w:rPr>
+          <w:sz w:val="22"/>
+          <w:szCs w:val="22"/>
+        </w:rPr>
+      </w:pPr>
+      <w:r>
+        <w:rPr>
+          <w:sz w:val="22"/>
+          <w:szCs w:val="22"/>
+        </w:rPr>
+        <w:t xml:space="preserve">Sabes que ahora lo </w:t>
+      </w:r>
+      <w:proofErr w:type="spellStart"/>
+      <w:r>
+        <w:rPr>
+          <w:sz w:val="22"/>
+          <w:szCs w:val="22"/>
+        </w:rPr>
+        <w:t>se</w:t>
+      </w:r>
+      <w:proofErr w:type="spellEnd"/>
+      <w:r>
+        <w:rPr>
+          <w:sz w:val="22"/>
+          <w:szCs w:val="22"/>
+        </w:rPr>
+        <w:t xml:space="preserve"> muy bien </w:t>
+      </w:r>
+    </w:p>
+    <w:p>
+      <w:pPr>
+        <w:pStyle w:val="NormalWeb"/>
+        <w:spacing w:line="360" w:lineRule="auto"/>
+        <w:rPr>
+          <w:sz w:val="22"/>
+          <w:szCs w:val="22"/>
+        </w:rPr>
+      </w:pPr>
+      <w:r>
+        <w:rPr>
+          <w:sz w:val="22"/>
+          <w:szCs w:val="22"/>
+        </w:rPr>
+        <w:t>Todo que lo que contaste, lo recordé</w:t>
+      </w:r>
+    </w:p>
+    <w:p>
+      <w:pPr>
+        <w:pStyle w:val="NormalWeb"/>
+        <w:spacing w:line="360" w:lineRule="auto"/>
+        <w:rPr>
+          <w:sz w:val="22"/>
+          <w:szCs w:val="22"/>
+        </w:rPr>
+      </w:pPr>
+      <w:r>
+        <w:rPr>
+          <w:sz w:val="22"/>
+          <w:szCs w:val="22"/>
+        </w:rPr>
+        <w:t xml:space="preserve">Eres importante </w:t>
+      </w:r>
+      <w:proofErr w:type="spellStart"/>
+      <w:r>
+        <w:rPr>
+          <w:sz w:val="22"/>
+          <w:szCs w:val="22"/>
+        </w:rPr>
+        <w:t>asi</w:t>
+      </w:r>
+      <w:proofErr w:type="spellEnd"/>
+      <w:r>
+        <w:rPr>
+          <w:sz w:val="22"/>
+          <w:szCs w:val="22"/>
+        </w:rPr>
+        <w:t xml:space="preserve"> que lo tengo en mi</w:t>
+      </w:r>
+    </w:p>
+    <w:p>
+      <w:pPr>
+        <w:pStyle w:val="NormalWeb"/>
+        <w:spacing w:line="360" w:lineRule="auto"/>
+        <w:rPr>
+          <w:sz w:val="22"/>
+          <w:szCs w:val="22"/>
+        </w:rPr>
+      </w:pPr>
+      <w:r>
+        <w:rPr>
+          <w:sz w:val="22"/>
+          <w:szCs w:val="22"/>
+        </w:rPr>
+        <w:t xml:space="preserve">Una carta de amor, de mi para ti </w:t>
+      </w:r>
+    </w:p>
+    <w:p>
+      <w:pPr>
+        <w:pStyle w:val="NormalWeb"/>
+        <w:spacing w:line="360" w:lineRule="auto"/>
+        <w:rPr>
+          <w:sz w:val="22"/>
+          <w:szCs w:val="22"/>
+        </w:rPr>
+      </w:pPr>
+    </w:p>
+    <w:p>
+      <w:pPr>
+        <w:pStyle w:val="NormalWeb"/>
+        <w:spacing w:line="360" w:lineRule="auto"/>
+        <w:rPr>
+          <w:sz w:val="22"/>
+          <w:szCs w:val="22"/>
+        </w:rPr>
+      </w:pPr>
+      <w:r>
+        <w:rPr>
+          <w:sz w:val="22"/>
+          <w:szCs w:val="22"/>
+        </w:rPr>
+        <w:t>Verso 2**</w:t>
+      </w:r>
+    </w:p>
+    <w:p>
+      <w:pPr>
+        <w:pStyle w:val="NormalWeb"/>
+        <w:spacing w:line="360" w:lineRule="auto"/>
+        <w:rPr>
+          <w:sz w:val="22"/>
+          <w:szCs w:val="22"/>
+        </w:rPr>
+      </w:pPr>
+      <w:proofErr w:type="spellStart"/>
+      <w:r>
+        <w:rPr>
+          <w:sz w:val="22"/>
+          <w:szCs w:val="22"/>
+        </w:rPr>
+        <w:t>Soulmate</w:t>
+      </w:r>
+      <w:proofErr w:type="spellEnd"/>
+      <w:r>
+        <w:rPr>
+          <w:sz w:val="22"/>
+          <w:szCs w:val="22"/>
+        </w:rPr>
+        <w:t xml:space="preserve">, </w:t>
+      </w:r>
+      <w:proofErr w:type="spellStart"/>
+      <w:r>
+        <w:rPr>
+          <w:sz w:val="22"/>
+          <w:szCs w:val="22"/>
+        </w:rPr>
+        <w:t>is</w:t>
+      </w:r>
+      <w:proofErr w:type="spellEnd"/>
+      <w:r>
+        <w:rPr>
+          <w:sz w:val="22"/>
+          <w:szCs w:val="22"/>
+        </w:rPr>
+        <w:t xml:space="preserve"> </w:t>
+      </w:r>
+      <w:proofErr w:type="spellStart"/>
+      <w:r>
+        <w:rPr>
+          <w:sz w:val="22"/>
+          <w:szCs w:val="22"/>
+        </w:rPr>
+        <w:t>that</w:t>
+      </w:r>
+      <w:proofErr w:type="spellEnd"/>
+      <w:r>
+        <w:rPr>
+          <w:sz w:val="22"/>
+          <w:szCs w:val="22"/>
+        </w:rPr>
+        <w:t xml:space="preserve"> </w:t>
+      </w:r>
+      <w:proofErr w:type="spellStart"/>
+      <w:r>
+        <w:rPr>
+          <w:sz w:val="22"/>
+          <w:szCs w:val="22"/>
+        </w:rPr>
+        <w:t>you</w:t>
+      </w:r>
+      <w:proofErr w:type="spellEnd"/>
+      <w:r>
+        <w:rPr>
+          <w:sz w:val="22"/>
+          <w:szCs w:val="22"/>
+        </w:rPr>
+        <w:t>?</w:t>
+      </w:r>
+    </w:p>
+    <w:p>
+      <w:pPr>
+        <w:pStyle w:val="NormalWeb"/>
+        <w:spacing w:line="360" w:lineRule="auto"/>
+        <w:rPr>
+          <w:sz w:val="22"/>
+          <w:szCs w:val="22"/>
+        </w:rPr>
+      </w:pPr>
+      <w:r>
+        <w:rPr>
+          <w:sz w:val="22"/>
+          <w:szCs w:val="22"/>
+        </w:rPr>
+        <w:t xml:space="preserve">Will I </w:t>
+      </w:r>
+      <w:proofErr w:type="spellStart"/>
+      <w:r>
+        <w:rPr>
+          <w:sz w:val="22"/>
+          <w:szCs w:val="22"/>
+        </w:rPr>
+        <w:t>see</w:t>
+      </w:r>
+      <w:proofErr w:type="spellEnd"/>
+      <w:r>
+        <w:rPr>
+          <w:sz w:val="22"/>
+          <w:szCs w:val="22"/>
+        </w:rPr>
+        <w:t xml:space="preserve"> </w:t>
+      </w:r>
+      <w:proofErr w:type="spellStart"/>
+      <w:r>
+        <w:rPr>
+          <w:sz w:val="22"/>
+          <w:szCs w:val="22"/>
+        </w:rPr>
+        <w:t>you</w:t>
+      </w:r>
+      <w:proofErr w:type="spellEnd"/>
+      <w:r>
+        <w:rPr>
+          <w:sz w:val="22"/>
+          <w:szCs w:val="22"/>
+        </w:rPr>
+        <w:t xml:space="preserve"> </w:t>
+      </w:r>
+      <w:proofErr w:type="spellStart"/>
+      <w:r>
+        <w:rPr>
+          <w:sz w:val="22"/>
+          <w:szCs w:val="22"/>
+        </w:rPr>
+        <w:t>tonight</w:t>
+      </w:r>
+      <w:proofErr w:type="spellEnd"/>
+      <w:r>
+        <w:rPr>
+          <w:sz w:val="22"/>
+          <w:szCs w:val="22"/>
+        </w:rPr>
+        <w:t>?</w:t>
+      </w:r>
+    </w:p>
+    <w:p>
+      <w:pPr>
+        <w:pStyle w:val="NormalWeb"/>
+        <w:spacing w:line="360" w:lineRule="auto"/>
+        <w:rPr>
+          <w:sz w:val="22"/>
+          <w:szCs w:val="22"/>
+        </w:rPr>
+      </w:pPr>
+      <w:proofErr w:type="spellStart"/>
+      <w:r>
+        <w:rPr>
+          <w:sz w:val="22"/>
+          <w:szCs w:val="22"/>
+        </w:rPr>
+        <w:t>Those</w:t>
+      </w:r>
+      <w:proofErr w:type="spellEnd"/>
+      <w:r>
+        <w:rPr>
+          <w:sz w:val="22"/>
+          <w:szCs w:val="22"/>
+        </w:rPr>
+        <w:t xml:space="preserve"> </w:t>
+      </w:r>
+      <w:proofErr w:type="spellStart"/>
+      <w:r>
+        <w:rPr>
+          <w:sz w:val="22"/>
+          <w:szCs w:val="22"/>
+        </w:rPr>
+        <w:t>gorgeous</w:t>
+      </w:r>
+      <w:proofErr w:type="spellEnd"/>
+      <w:r>
+        <w:rPr>
+          <w:sz w:val="22"/>
+          <w:szCs w:val="22"/>
+        </w:rPr>
+        <w:t xml:space="preserve"> </w:t>
+      </w:r>
+      <w:proofErr w:type="spellStart"/>
+      <w:r>
+        <w:rPr>
+          <w:sz w:val="22"/>
+          <w:szCs w:val="22"/>
+        </w:rPr>
+        <w:t>eyes</w:t>
+      </w:r>
+      <w:proofErr w:type="spellEnd"/>
+      <w:r>
+        <w:rPr>
+          <w:sz w:val="22"/>
+          <w:szCs w:val="22"/>
+        </w:rPr>
+        <w:t xml:space="preserve"> </w:t>
+      </w:r>
+      <w:proofErr w:type="spellStart"/>
+      <w:r>
+        <w:rPr>
+          <w:sz w:val="22"/>
+          <w:szCs w:val="22"/>
+        </w:rPr>
+        <w:t>make</w:t>
+      </w:r>
+      <w:proofErr w:type="spellEnd"/>
+      <w:r>
+        <w:rPr>
+          <w:sz w:val="22"/>
+          <w:szCs w:val="22"/>
+        </w:rPr>
+        <w:t xml:space="preserve"> me </w:t>
+      </w:r>
+      <w:proofErr w:type="spellStart"/>
+      <w:r>
+        <w:rPr>
+          <w:sz w:val="22"/>
+          <w:szCs w:val="22"/>
+        </w:rPr>
+        <w:t>high</w:t>
+      </w:r>
+      <w:proofErr w:type="spellEnd"/>
+    </w:p>
+    <w:p>
+      <w:pPr>
+        <w:pStyle w:val="NormalWeb"/>
+        <w:spacing w:line="360" w:lineRule="auto"/>
+        <w:rPr>
+          <w:sz w:val="22"/>
+          <w:szCs w:val="22"/>
+        </w:rPr>
+      </w:pPr>
+      <w:proofErr w:type="spellStart"/>
+      <w:r>
+        <w:rPr>
+          <w:sz w:val="22"/>
+          <w:szCs w:val="22"/>
+        </w:rPr>
+        <w:t>Like</w:t>
+      </w:r>
+      <w:proofErr w:type="spellEnd"/>
+      <w:r>
+        <w:rPr>
+          <w:sz w:val="22"/>
+          <w:szCs w:val="22"/>
+        </w:rPr>
+        <w:t xml:space="preserve"> a </w:t>
+      </w:r>
+      <w:proofErr w:type="spellStart"/>
+      <w:r>
+        <w:rPr>
+          <w:sz w:val="22"/>
+          <w:szCs w:val="22"/>
+        </w:rPr>
+        <w:t>bird</w:t>
+      </w:r>
+      <w:proofErr w:type="spellEnd"/>
+      <w:r>
+        <w:rPr>
+          <w:sz w:val="22"/>
+          <w:szCs w:val="22"/>
+        </w:rPr>
+        <w:t xml:space="preserve">, </w:t>
+      </w:r>
+      <w:proofErr w:type="spellStart"/>
+      <w:r>
+        <w:rPr>
+          <w:sz w:val="22"/>
+          <w:szCs w:val="22"/>
+        </w:rPr>
+        <w:t>flying</w:t>
+      </w:r>
+      <w:proofErr w:type="spellEnd"/>
+      <w:r>
+        <w:rPr>
+          <w:sz w:val="22"/>
+          <w:szCs w:val="22"/>
+        </w:rPr>
+        <w:t xml:space="preserve"> </w:t>
+      </w:r>
+      <w:proofErr w:type="spellStart"/>
+      <w:r>
+        <w:rPr>
+          <w:sz w:val="22"/>
+          <w:szCs w:val="22"/>
+        </w:rPr>
+        <w:t>through</w:t>
+      </w:r>
+      <w:proofErr w:type="spellEnd"/>
+      <w:r>
+        <w:rPr>
+          <w:sz w:val="22"/>
+          <w:szCs w:val="22"/>
+        </w:rPr>
+        <w:t xml:space="preserve"> </w:t>
+      </w:r>
+      <w:proofErr w:type="spellStart"/>
+      <w:r>
+        <w:rPr>
+          <w:sz w:val="22"/>
+          <w:szCs w:val="22"/>
+        </w:rPr>
+        <w:t>my</w:t>
+      </w:r>
+      <w:proofErr w:type="spellEnd"/>
+      <w:r>
+        <w:rPr>
+          <w:sz w:val="22"/>
+          <w:szCs w:val="22"/>
+        </w:rPr>
+        <w:t xml:space="preserve"> </w:t>
+      </w:r>
+      <w:proofErr w:type="spellStart"/>
+      <w:r>
+        <w:rPr>
+          <w:sz w:val="22"/>
+          <w:szCs w:val="22"/>
+        </w:rPr>
+        <w:t>mind</w:t>
+      </w:r>
+      <w:proofErr w:type="spellEnd"/>
+    </w:p>
+    <w:p>
+      <w:pPr>
+        <w:pStyle w:val="NormalWeb"/>
+        <w:spacing w:line="360" w:lineRule="auto"/>
+        <w:rPr>
+          <w:sz w:val="22"/>
+          <w:szCs w:val="22"/>
+        </w:rPr>
+      </w:pPr>
+    </w:p>
+    <w:p>
+      <w:pPr>
+        <w:pStyle w:val="NormalWeb"/>
+        <w:spacing w:line="360" w:lineRule="auto"/>
+        <w:rPr>
+          <w:sz w:val="22"/>
+          <w:szCs w:val="22"/>
+        </w:rPr>
+      </w:pPr>
+      <w:r>
+        <w:rPr>
+          <w:sz w:val="22"/>
+          <w:szCs w:val="22"/>
+        </w:rPr>
+        <w:t>Un ángel, llego a mi</w:t>
+      </w:r>
+    </w:p>
+    <w:p>
+      <w:pPr>
+        <w:pStyle w:val="NormalWeb"/>
+        <w:spacing w:line="360" w:lineRule="auto"/>
+        <w:rPr>
+          <w:sz w:val="22"/>
+          <w:szCs w:val="22"/>
+        </w:rPr>
+      </w:pPr>
+      <w:r>
+        <w:rPr>
+          <w:sz w:val="22"/>
+          <w:szCs w:val="22"/>
+        </w:rPr>
+        <w:t xml:space="preserve">No se si pueda alcanzar sus alas </w:t>
+      </w:r>
+    </w:p>
+    <w:p>
+      <w:pPr>
+        <w:pStyle w:val="NormalWeb"/>
+        <w:spacing w:line="360" w:lineRule="auto"/>
+        <w:rPr>
+          <w:sz w:val="22"/>
+          <w:szCs w:val="22"/>
+        </w:rPr>
+      </w:pPr>
+      <w:r>
+        <w:rPr>
+          <w:sz w:val="22"/>
+          <w:szCs w:val="22"/>
+        </w:rPr>
+        <w:t>O si podre resistir</w:t>
+      </w:r>
+    </w:p>
+    <w:p>
+      <w:pPr>
+        <w:pStyle w:val="NormalWeb"/>
+        <w:spacing w:line="360" w:lineRule="auto"/>
+        <w:rPr>
+          <w:sz w:val="22"/>
+          <w:szCs w:val="22"/>
+        </w:rPr>
+      </w:pPr>
+      <w:r>
+        <w:rPr>
+          <w:sz w:val="22"/>
+          <w:szCs w:val="22"/>
+        </w:rPr>
+        <w:t xml:space="preserve">Pero el amor divino, </w:t>
+      </w:r>
+      <w:r>
+        <w:rPr>
+          <w:sz w:val="22"/>
+          <w:szCs w:val="22"/>
+        </w:rPr>
+        <w:t>me atrapa</w:t>
+      </w:r>
+    </w:p>
+    <w:p>
+      <w:pPr>
+        <w:pStyle w:val="NormalWeb"/>
+        <w:spacing w:line="360" w:lineRule="auto"/>
+        <w:rPr>
+          <w:sz w:val="22"/>
+          <w:szCs w:val="22"/>
+        </w:rPr>
+      </w:pPr>
+    </w:p>
+    <w:p>
+      <w:pPr>
+        <w:pStyle w:val="NormalWeb"/>
+        <w:spacing w:line="360" w:lineRule="auto"/>
+        <w:rPr>
+          <w:sz w:val="22"/>
+          <w:szCs w:val="22"/>
+        </w:rPr>
+      </w:pPr>
+      <w:r>
+        <w:rPr>
+          <w:sz w:val="22"/>
+          <w:szCs w:val="22"/>
+        </w:rPr>
+        <w:t>PRECHORUS 2</w:t>
+      </w:r>
+    </w:p>
+    <w:p>
+      <w:pPr>
+        <w:pStyle w:val="NormalWeb"/>
+        <w:spacing w:line="360" w:lineRule="auto"/>
+        <w:rPr>
+          <w:sz w:val="22"/>
+          <w:szCs w:val="22"/>
+        </w:rPr>
+      </w:pPr>
+      <w:r>
+        <w:rPr>
+          <w:sz w:val="22"/>
+          <w:szCs w:val="22"/>
+        </w:rPr>
+        <w:t xml:space="preserve">Si lo </w:t>
+      </w:r>
+      <w:r>
+        <w:rPr>
+          <w:sz w:val="22"/>
+          <w:szCs w:val="22"/>
+        </w:rPr>
+        <w:t>sabes, antes</w:t>
+      </w:r>
+      <w:r>
+        <w:rPr>
+          <w:sz w:val="22"/>
+          <w:szCs w:val="22"/>
+        </w:rPr>
+        <w:t xml:space="preserve"> de que lo diga</w:t>
+      </w:r>
+    </w:p>
+    <w:p>
+      <w:pPr>
+        <w:pStyle w:val="NormalWeb"/>
+        <w:spacing w:line="360" w:lineRule="auto"/>
+        <w:rPr>
+          <w:sz w:val="22"/>
+          <w:szCs w:val="22"/>
+        </w:rPr>
+      </w:pPr>
+      <w:r>
+        <w:rPr>
+          <w:sz w:val="22"/>
+          <w:szCs w:val="22"/>
+        </w:rPr>
+        <w:lastRenderedPageBreak/>
+        <w:t xml:space="preserve">Es algo tan raro y </w:t>
+      </w:r>
+      <w:r>
+        <w:rPr>
+          <w:sz w:val="22"/>
+          <w:szCs w:val="22"/>
+        </w:rPr>
+        <w:t>eufórico</w:t>
+      </w:r>
+    </w:p>
+    <w:p>
+      <w:pPr>
+        <w:pStyle w:val="NormalWeb"/>
+        <w:spacing w:line="360" w:lineRule="auto"/>
+        <w:rPr>
+          <w:sz w:val="22"/>
+          <w:szCs w:val="22"/>
+        </w:rPr>
+      </w:pPr>
+      <w:r>
+        <w:rPr>
+          <w:sz w:val="22"/>
+          <w:szCs w:val="22"/>
+        </w:rPr>
+        <w:t>¿No me digas que ya estuviste en mi vida?</w:t>
+      </w:r>
+    </w:p>
+    <w:p>
+      <w:pPr>
+        <w:pStyle w:val="NormalWeb"/>
+        <w:spacing w:line="360" w:lineRule="auto"/>
+        <w:rPr>
+          <w:sz w:val="22"/>
+          <w:szCs w:val="22"/>
+        </w:rPr>
+      </w:pPr>
+      <w:r>
+        <w:rPr>
+          <w:sz w:val="22"/>
+          <w:szCs w:val="22"/>
+        </w:rPr>
+        <w:t>Necesito un beso de ti</w:t>
+      </w:r>
+      <w:r>
+        <w:rPr>
+          <w:sz w:val="22"/>
+          <w:szCs w:val="22"/>
+        </w:rPr>
+        <w:t>, mi amor platónico</w:t>
+      </w:r>
+    </w:p>
+    <w:p>
+      <w:pPr>
+        <w:pStyle w:val="NormalWeb"/>
+        <w:spacing w:line="360" w:lineRule="auto"/>
+        <w:rPr>
+          <w:sz w:val="22"/>
+          <w:szCs w:val="22"/>
+        </w:rPr>
+      </w:pPr>
+      <w:r>
+        <w:rPr>
+          <w:sz w:val="22"/>
+          <w:szCs w:val="22"/>
+        </w:rPr>
+        <w:t>Choros</w:t>
+      </w:r>
+    </w:p>
+    <w:p>
+      <w:pPr>
+        <w:pStyle w:val="NormalWeb"/>
+        <w:spacing w:line="360" w:lineRule="auto"/>
+        <w:rPr>
+          <w:sz w:val="22"/>
+          <w:szCs w:val="22"/>
+        </w:rPr>
+      </w:pPr>
+      <w:r>
+        <w:rPr>
+          <w:sz w:val="22"/>
+          <w:szCs w:val="22"/>
+        </w:rPr>
+        <w:t xml:space="preserve">Sabes que ahora lo </w:t>
+      </w:r>
+      <w:proofErr w:type="spellStart"/>
+      <w:r>
+        <w:rPr>
+          <w:sz w:val="22"/>
+          <w:szCs w:val="22"/>
+        </w:rPr>
+        <w:t>se</w:t>
+      </w:r>
+      <w:proofErr w:type="spellEnd"/>
+      <w:r>
+        <w:rPr>
+          <w:sz w:val="22"/>
+          <w:szCs w:val="22"/>
+        </w:rPr>
+        <w:t xml:space="preserve"> muy bien </w:t>
+      </w:r>
+    </w:p>
+    <w:p>
+      <w:pPr>
+        <w:pStyle w:val="NormalWeb"/>
+        <w:spacing w:line="360" w:lineRule="auto"/>
+        <w:rPr>
+          <w:sz w:val="22"/>
+          <w:szCs w:val="22"/>
+        </w:rPr>
+      </w:pPr>
+      <w:r>
+        <w:rPr>
+          <w:sz w:val="22"/>
+          <w:szCs w:val="22"/>
+        </w:rPr>
+        <w:t>Todo que lo que contaste, lo recordé</w:t>
+      </w:r>
+    </w:p>
+    <w:p>
+      <w:pPr>
+        <w:pStyle w:val="NormalWeb"/>
+        <w:spacing w:line="360" w:lineRule="auto"/>
+        <w:rPr>
+          <w:sz w:val="22"/>
+          <w:szCs w:val="22"/>
+        </w:rPr>
+      </w:pPr>
+      <w:r>
+        <w:rPr>
+          <w:sz w:val="22"/>
+          <w:szCs w:val="22"/>
+        </w:rPr>
+        <w:t xml:space="preserve">Eres importante </w:t>
+      </w:r>
+      <w:proofErr w:type="spellStart"/>
+      <w:r>
+        <w:rPr>
+          <w:sz w:val="22"/>
+          <w:szCs w:val="22"/>
+        </w:rPr>
+        <w:t>asi</w:t>
+      </w:r>
+      <w:proofErr w:type="spellEnd"/>
+      <w:r>
+        <w:rPr>
+          <w:sz w:val="22"/>
+          <w:szCs w:val="22"/>
+        </w:rPr>
+        <w:t xml:space="preserve"> que lo tengo en mi</w:t>
+      </w:r>
+    </w:p>
+    <w:p>
+      <w:pPr>
+        <w:pStyle w:val="NormalWeb"/>
+        <w:spacing w:line="360" w:lineRule="auto"/>
+        <w:rPr>
+          <w:sz w:val="22"/>
+          <w:szCs w:val="22"/>
+        </w:rPr>
+      </w:pPr>
+      <w:r>
+        <w:rPr>
+          <w:sz w:val="22"/>
+          <w:szCs w:val="22"/>
+        </w:rPr>
+        <w:t xml:space="preserve">Una carta de amor, de mi para ti </w:t>
+      </w:r>
+    </w:p>
+    <w:p>
+      <w:pPr>
+        <w:pStyle w:val="NormalWeb"/>
+        <w:spacing w:line="360" w:lineRule="auto"/>
+        <w:rPr>
+          <w:sz w:val="22"/>
+          <w:szCs w:val="22"/>
+        </w:rPr>
+      </w:pPr>
+    </w:p>
+    <w:p>
+      <w:pPr>
+        <w:pStyle w:val="NormalWeb"/>
+        <w:spacing w:line="360" w:lineRule="auto"/>
+        <w:rPr>
+          <w:sz w:val="22"/>
+          <w:szCs w:val="22"/>
+        </w:rPr>
+      </w:pPr>
+      <w:r>
+        <w:rPr>
+          <w:sz w:val="22"/>
+          <w:szCs w:val="22"/>
+        </w:rPr>
+        <w:t xml:space="preserve">Sabes que ahora lo </w:t>
+      </w:r>
+      <w:proofErr w:type="spellStart"/>
+      <w:r>
+        <w:rPr>
+          <w:sz w:val="22"/>
+          <w:szCs w:val="22"/>
+        </w:rPr>
+        <w:t>se</w:t>
+      </w:r>
+      <w:proofErr w:type="spellEnd"/>
+      <w:r>
+        <w:rPr>
+          <w:sz w:val="22"/>
+          <w:szCs w:val="22"/>
+        </w:rPr>
+        <w:t xml:space="preserve"> muy bien </w:t>
+      </w:r>
+    </w:p>
+    <w:p>
+      <w:pPr>
+        <w:pStyle w:val="NormalWeb"/>
+        <w:spacing w:line="360" w:lineRule="auto"/>
+        <w:rPr>
+          <w:sz w:val="22"/>
+          <w:szCs w:val="22"/>
+        </w:rPr>
+      </w:pPr>
+      <w:r>
+        <w:rPr>
+          <w:sz w:val="22"/>
+          <w:szCs w:val="22"/>
+        </w:rPr>
+        <w:t>Todo que lo que contaste, lo recordé</w:t>
+      </w:r>
+    </w:p>
+    <w:p>
+      <w:pPr>
+        <w:pStyle w:val="NormalWeb"/>
+        <w:spacing w:line="360" w:lineRule="auto"/>
+        <w:rPr>
+          <w:sz w:val="22"/>
+          <w:szCs w:val="22"/>
+        </w:rPr>
+      </w:pPr>
+      <w:r>
+        <w:rPr>
+          <w:sz w:val="22"/>
+          <w:szCs w:val="22"/>
+        </w:rPr>
+        <w:t xml:space="preserve">Eres importante </w:t>
+      </w:r>
+      <w:proofErr w:type="spellStart"/>
+      <w:r>
+        <w:rPr>
+          <w:sz w:val="22"/>
+          <w:szCs w:val="22"/>
+        </w:rPr>
+        <w:t>asi</w:t>
+      </w:r>
+      <w:proofErr w:type="spellEnd"/>
+      <w:r>
+        <w:rPr>
+          <w:sz w:val="22"/>
+          <w:szCs w:val="22"/>
+        </w:rPr>
+        <w:t xml:space="preserve"> que lo tengo en mi</w:t>
+      </w:r>
+    </w:p>
+    <w:p>
+      <w:pPr>
+        <w:pStyle w:val="NormalWeb"/>
+        <w:spacing w:line="360" w:lineRule="auto"/>
+        <w:rPr>
+          <w:sz w:val="22"/>
+          <w:szCs w:val="22"/>
+        </w:rPr>
+      </w:pPr>
+      <w:r>
+        <w:rPr>
+          <w:sz w:val="22"/>
+          <w:szCs w:val="22"/>
+        </w:rPr>
+        <w:t xml:space="preserve">Una carta de amor, de mi para ti </w:t>
+      </w:r>
+    </w:p>
+    <w:p>
+      <w:pPr>
+        <w:pStyle w:val="NormalWeb"/>
+        <w:spacing w:line="360" w:lineRule="auto"/>
+        <w:rPr>
+          <w:sz w:val="22"/>
+          <w:szCs w:val="22"/>
+        </w:rPr>
+      </w:pPr>
+    </w:p>
+    <w:p>
+      <w:pPr>
+        <w:pStyle w:val="NormalWeb"/>
+        <w:spacing w:line="360" w:lineRule="auto"/>
+        <w:rPr>
+          <w:sz w:val="22"/>
+          <w:szCs w:val="22"/>
+        </w:rPr>
+      </w:pPr>
+      <w:r>
+        <w:rPr>
+          <w:sz w:val="22"/>
+          <w:szCs w:val="22"/>
+        </w:rPr>
+        <w:t>Puente**</w:t>
+      </w:r>
+    </w:p>
+    <w:p>
+      <w:pPr>
+        <w:pStyle w:val="NormalWeb"/>
+        <w:spacing w:line="360" w:lineRule="auto"/>
+        <w:rPr>
+          <w:sz w:val="22"/>
+          <w:szCs w:val="22"/>
+        </w:rPr>
+      </w:pPr>
+      <w:r>
+        <w:rPr>
+          <w:sz w:val="22"/>
+          <w:szCs w:val="22"/>
+        </w:rPr>
+        <w:t>Esto es el final del papel, pero no de la letra</w:t>
+      </w:r>
+    </w:p>
+    <w:p>
+      <w:pPr>
+        <w:pStyle w:val="NormalWeb"/>
+        <w:spacing w:line="360" w:lineRule="auto"/>
+        <w:rPr>
+          <w:sz w:val="22"/>
+          <w:szCs w:val="22"/>
+        </w:rPr>
+      </w:pPr>
+      <w:r>
+        <w:rPr>
+          <w:sz w:val="22"/>
+          <w:szCs w:val="22"/>
+        </w:rPr>
+        <w:t>Te voy redescubriendo</w:t>
+      </w:r>
+      <w:r>
+        <w:rPr>
+          <w:sz w:val="22"/>
+          <w:szCs w:val="22"/>
+        </w:rPr>
+        <w:t>, sonrisas que alegran</w:t>
+      </w:r>
+      <w:r>
+        <w:rPr>
+          <w:sz w:val="22"/>
+          <w:szCs w:val="22"/>
+        </w:rPr>
+        <w:t xml:space="preserve"> </w:t>
+      </w:r>
+    </w:p>
+    <w:p>
+      <w:pPr>
+        <w:pStyle w:val="NormalWeb"/>
+        <w:spacing w:line="360" w:lineRule="auto"/>
+        <w:rPr>
+          <w:sz w:val="22"/>
+          <w:szCs w:val="22"/>
+        </w:rPr>
+      </w:pPr>
+      <w:r>
+        <w:rPr>
+          <w:sz w:val="22"/>
+          <w:szCs w:val="22"/>
+        </w:rPr>
+        <w:t xml:space="preserve">Polo </w:t>
+      </w:r>
+      <w:r>
+        <w:rPr>
+          <w:sz w:val="22"/>
+          <w:szCs w:val="22"/>
+        </w:rPr>
+        <w:t>iguales se repelen</w:t>
+      </w:r>
+      <w:r>
+        <w:rPr>
+          <w:sz w:val="22"/>
+          <w:szCs w:val="22"/>
+        </w:rPr>
+        <w:t xml:space="preserve"> eso dice la regla</w:t>
+      </w:r>
+    </w:p>
+    <w:p>
+      <w:pPr>
+        <w:pStyle w:val="NormalWeb"/>
+        <w:spacing w:line="360" w:lineRule="auto"/>
+        <w:rPr>
+          <w:sz w:val="22"/>
+          <w:szCs w:val="22"/>
+        </w:rPr>
+      </w:pPr>
+      <w:r>
+        <w:rPr>
+          <w:sz w:val="22"/>
+          <w:szCs w:val="22"/>
+        </w:rPr>
+        <w:t xml:space="preserve">Supongo que hay una primera vez, para romperla </w:t>
+      </w:r>
+    </w:p>
+    <w:p>
+      <w:pPr>
+        <w:pStyle w:val="NormalWeb"/>
+        <w:spacing w:line="360" w:lineRule="auto"/>
+        <w:rPr>
+          <w:sz w:val="22"/>
+          <w:szCs w:val="22"/>
+        </w:rPr>
+      </w:pPr>
+    </w:p>
+    <w:p>
+      <w:pPr>
+        <w:pStyle w:val="NormalWeb"/>
+        <w:spacing w:line="360" w:lineRule="auto"/>
+        <w:rPr>
+          <w:sz w:val="22"/>
+          <w:szCs w:val="22"/>
+        </w:rPr>
+      </w:pPr>
+    </w:p>
+    <w:p>
+      <w:pPr>
+        <w:pStyle w:val="NormalWeb"/>
+        <w:spacing w:line="360" w:lineRule="auto"/>
+        <w:rPr>
+          <w:sz w:val="22"/>
+          <w:szCs w:val="22"/>
+        </w:rPr>
+      </w:pPr>
+      <w:r>
+        <w:rPr>
+          <w:sz w:val="22"/>
+          <w:szCs w:val="22"/>
+        </w:rPr>
+        <w:lastRenderedPageBreak/>
+        <w:t xml:space="preserve">Sabes que ahora lo </w:t>
+      </w:r>
+      <w:proofErr w:type="spellStart"/>
+      <w:r>
+        <w:rPr>
+          <w:sz w:val="22"/>
+          <w:szCs w:val="22"/>
+        </w:rPr>
+        <w:t>se</w:t>
+      </w:r>
+      <w:proofErr w:type="spellEnd"/>
+      <w:r>
+        <w:rPr>
+          <w:sz w:val="22"/>
+          <w:szCs w:val="22"/>
+        </w:rPr>
+        <w:t xml:space="preserve"> muy bien </w:t>
+      </w:r>
+    </w:p>
+    <w:p>
+      <w:pPr>
+        <w:pStyle w:val="NormalWeb"/>
+        <w:spacing w:line="360" w:lineRule="auto"/>
+        <w:rPr>
+          <w:sz w:val="22"/>
+          <w:szCs w:val="22"/>
+        </w:rPr>
+      </w:pPr>
+      <w:r>
+        <w:rPr>
+          <w:sz w:val="22"/>
+          <w:szCs w:val="22"/>
+        </w:rPr>
+        <w:t>Todo que lo que contaste, lo recordé</w:t>
+      </w:r>
+    </w:p>
+    <w:p>
+      <w:pPr>
+        <w:pStyle w:val="NormalWeb"/>
+        <w:spacing w:line="360" w:lineRule="auto"/>
+        <w:rPr>
+          <w:sz w:val="22"/>
+          <w:szCs w:val="22"/>
+        </w:rPr>
+      </w:pPr>
+      <w:r>
+        <w:rPr>
+          <w:sz w:val="22"/>
+          <w:szCs w:val="22"/>
+        </w:rPr>
+        <w:t xml:space="preserve">Eres importante </w:t>
+      </w:r>
+      <w:proofErr w:type="spellStart"/>
+      <w:r>
+        <w:rPr>
+          <w:sz w:val="22"/>
+          <w:szCs w:val="22"/>
+        </w:rPr>
+        <w:t>asi</w:t>
+      </w:r>
+      <w:proofErr w:type="spellEnd"/>
+      <w:r>
+        <w:rPr>
+          <w:sz w:val="22"/>
+          <w:szCs w:val="22"/>
+        </w:rPr>
+        <w:t xml:space="preserve"> que lo tengo en mi</w:t>
+      </w:r>
+    </w:p>
+    <w:p>
+      <w:pPr>
+        <w:pStyle w:val="NormalWeb"/>
+        <w:spacing w:line="360" w:lineRule="auto"/>
+        <w:rPr>
+          <w:sz w:val="22"/>
+          <w:szCs w:val="22"/>
+        </w:rPr>
+      </w:pPr>
+      <w:r>
+        <w:rPr>
+          <w:sz w:val="22"/>
+          <w:szCs w:val="22"/>
+        </w:rPr>
+        <w:t xml:space="preserve">Una carta de amor, de mi para ti </w:t>
+      </w:r>
+    </w:p>
+    <w:p>
+      <w:pPr>
+        <w:pStyle w:val="NormalWeb"/>
+        <w:spacing w:line="360" w:lineRule="auto"/>
+        <w:rPr>
+          <w:sz w:val="22"/>
+          <w:szCs w:val="22"/>
+        </w:rPr>
+      </w:pPr>
+    </w:p>
+    <w:p>
+      <w:pPr>
+        <w:pStyle w:val="NormalWeb"/>
+        <w:spacing w:line="360" w:lineRule="auto"/>
+        <w:rPr>
+          <w:sz w:val="22"/>
+          <w:szCs w:val="22"/>
+        </w:rPr>
+      </w:pPr>
+      <w:proofErr w:type="spellStart"/>
+      <w:r>
+        <w:rPr>
+          <w:sz w:val="22"/>
+          <w:szCs w:val="22"/>
+        </w:rPr>
+        <w:t>Outro</w:t>
+      </w:r>
+      <w:proofErr w:type="spellEnd"/>
+      <w:r>
+        <w:rPr>
+          <w:sz w:val="22"/>
+          <w:szCs w:val="22"/>
+        </w:rPr>
+        <w:t>**</w:t>
+      </w:r>
+    </w:p>
+    <w:p>
+      <w:pPr>
+        <w:pStyle w:val="NormalWeb"/>
+        <w:spacing w:line="360" w:lineRule="auto"/>
+        <w:rPr>
+          <w:sz w:val="22"/>
+          <w:szCs w:val="22"/>
+        </w:rPr>
+      </w:pPr>
+      <w:proofErr w:type="gramStart"/>
+      <w:r>
+        <w:rPr>
+          <w:sz w:val="22"/>
+          <w:szCs w:val="22"/>
+        </w:rPr>
+        <w:t>Siento que lo eres sabes?</w:t>
+      </w:r>
+      <w:proofErr w:type="gramEnd"/>
+    </w:p>
+    <w:p>
+      <w:pPr>
+        <w:pStyle w:val="NormalWeb"/>
+        <w:spacing w:line="360" w:lineRule="auto"/>
+        <w:rPr>
+          <w:sz w:val="22"/>
+          <w:szCs w:val="22"/>
+        </w:rPr>
+      </w:pPr>
+      <w:r>
+        <w:rPr>
+          <w:sz w:val="22"/>
+          <w:szCs w:val="22"/>
+        </w:rPr>
+        <w:t xml:space="preserve">No </w:t>
+      </w:r>
+      <w:proofErr w:type="spellStart"/>
+      <w:r>
+        <w:rPr>
+          <w:sz w:val="22"/>
+          <w:szCs w:val="22"/>
+        </w:rPr>
+        <w:t>se</w:t>
+      </w:r>
+      <w:proofErr w:type="spellEnd"/>
+      <w:r>
+        <w:rPr>
+          <w:sz w:val="22"/>
+          <w:szCs w:val="22"/>
+        </w:rPr>
+        <w:t xml:space="preserve"> si sea </w:t>
+      </w:r>
+      <w:proofErr w:type="gramStart"/>
+      <w:r>
+        <w:rPr>
+          <w:sz w:val="22"/>
+          <w:szCs w:val="22"/>
+        </w:rPr>
+        <w:t xml:space="preserve">cierto,  </w:t>
+      </w:r>
+      <w:r>
+        <w:rPr>
+          <w:sz w:val="22"/>
+          <w:szCs w:val="22"/>
+        </w:rPr>
+        <w:t>es</w:t>
+      </w:r>
+      <w:proofErr w:type="gramEnd"/>
+      <w:r>
+        <w:rPr>
+          <w:sz w:val="22"/>
+          <w:szCs w:val="22"/>
+        </w:rPr>
+        <w:t xml:space="preserve"> que me aterra</w:t>
+      </w:r>
+    </w:p>
+    <w:p>
+      <w:pPr>
+        <w:pStyle w:val="NormalWeb"/>
+        <w:spacing w:line="360" w:lineRule="auto"/>
+        <w:rPr>
+          <w:sz w:val="22"/>
+          <w:szCs w:val="22"/>
+        </w:rPr>
+      </w:pPr>
+      <w:r>
+        <w:rPr>
+          <w:sz w:val="22"/>
+          <w:szCs w:val="22"/>
+        </w:rPr>
+        <w:t xml:space="preserve">Que después de todo </w:t>
+      </w:r>
+      <w:r>
+        <w:rPr>
+          <w:sz w:val="22"/>
+          <w:szCs w:val="22"/>
+        </w:rPr>
+        <w:t>tengo adelante</w:t>
+      </w:r>
+    </w:p>
+    <w:p>
+      <w:pPr>
+        <w:pStyle w:val="NormalWeb"/>
+        <w:spacing w:line="360" w:lineRule="auto"/>
+        <w:rPr>
+          <w:sz w:val="22"/>
+          <w:szCs w:val="22"/>
+        </w:rPr>
+      </w:pPr>
+      <w:r>
+        <w:rPr>
+          <w:sz w:val="22"/>
+          <w:szCs w:val="22"/>
+        </w:rPr>
+        <w:t>A mi alma gemela</w:t>
+      </w:r>
     </w:p>
     <w:p>
       <w:pPr>
@@ -9992,6 +13144,56 @@
     </w:sectPr>
   </w:body>
 </w:document>
+</file>
+
+<file path=word/endnotes.xml><?xml version="1.0" encoding="utf-8"?>
+<w:endnotes xmlns:wpc="http://schemas.microsoft.com/office/word/2010/wordprocessingCanvas" xmlns:cx="http://schemas.microsoft.com/office/drawing/2014/chartex" xmlns:cx1="http://schemas.microsoft.com/office/drawing/2015/9/8/chartex" xmlns:cx2="http://schemas.microsoft.com/office/drawing/2015/10/21/chartex" xmlns:cx3="http://schemas.microsoft.com/office/drawing/2016/5/9/chartex" xmlns:cx4="http://schemas.microsoft.com/office/drawing/2016/5/10/chartex" xmlns:cx5="http://schemas.microsoft.com/office/drawing/2016/5/11/chartex" xmlns:cx6="http://schemas.microsoft.com/office/drawing/2016/5/12/chartex" xmlns:cx7="http://schemas.microsoft.com/office/drawing/2016/5/13/chartex" xmlns:cx8="http://schemas.microsoft.com/office/drawing/2016/5/14/chartex" xmlns:mc="http://schemas.openxmlformats.org/markup-compatibility/2006" xmlns:aink="http://schemas.microsoft.com/office/drawing/2016/ink" xmlns:am3d="http://schemas.microsoft.com/office/drawing/2017/model3d" xmlns:o="urn:schemas-microsoft-com:office:office" xmlns:r="http://schemas.openxmlformats.org/officeDocument/2006/relationships" xmlns:m="http://schemas.openxmlformats.org/officeDocument/2006/math" xmlns:v="urn:schemas-microsoft-com:vml" xmlns:wp14="http://schemas.microsoft.com/office/word/2010/wordprocessingDrawing" xmlns:wp="http://schemas.openxmlformats.org/drawingml/2006/wordprocessingDrawing" xmlns:w10="urn:schemas-microsoft-com:office:word" xmlns:w="http://schemas.openxmlformats.org/wordprocessingml/2006/main" xmlns:w14="http://schemas.microsoft.com/office/word/2010/wordml" xmlns:w15="http://schemas.microsoft.com/office/word/2012/wordml" xmlns:w16cex="http://schemas.microsoft.com/office/word/2018/wordml/cex" xmlns:w16cid="http://schemas.microsoft.com/office/word/2016/wordml/cid" xmlns:w16="http://schemas.microsoft.com/office/word/2018/wordml" xmlns:w16sdtdh="http://schemas.microsoft.com/office/word/2020/wordml/sdtdatahash" xmlns:w16se="http://schemas.microsoft.com/office/word/2015/wordml/symex" xmlns:wpg="http://schemas.microsoft.com/office/word/2010/wordprocessingGroup" xmlns:wpi="http://schemas.microsoft.com/office/word/2010/wordprocessingInk" xmlns:wne="http://schemas.microsoft.com/office/word/2006/wordml" xmlns:wps="http://schemas.microsoft.com/office/word/2010/wordprocessingShape" mc:Ignorable="w14 w15 w16se w16cid w16 w16cex w16sdtdh wp14">
+  <w:endnote w:type="separator" w:id="-1">
+    <w:p>
+      <w:pPr>
+        <w:spacing w:after="0" w:line="240" w:lineRule="auto"/>
+      </w:pPr>
+      <w:r>
+        <w:separator/>
+      </w:r>
+    </w:p>
+  </w:endnote>
+  <w:endnote w:type="continuationSeparator" w:id="0">
+    <w:p>
+      <w:pPr>
+        <w:spacing w:after="0" w:line="240" w:lineRule="auto"/>
+      </w:pPr>
+      <w:r>
+        <w:continuationSeparator/>
+      </w:r>
+    </w:p>
+  </w:endnote>
+</w:endnotes>
+</file>
+
+<file path=word/footnotes.xml><?xml version="1.0" encoding="utf-8"?>
+<w:footnotes xmlns:wpc="http://schemas.microsoft.com/office/word/2010/wordprocessingCanvas" xmlns:cx="http://schemas.microsoft.com/office/drawing/2014/chartex" xmlns:cx1="http://schemas.microsoft.com/office/drawing/2015/9/8/chartex" xmlns:cx2="http://schemas.microsoft.com/office/drawing/2015/10/21/chartex" xmlns:cx3="http://schemas.microsoft.com/office/drawing/2016/5/9/chartex" xmlns:cx4="http://schemas.microsoft.com/office/drawing/2016/5/10/chartex" xmlns:cx5="http://schemas.microsoft.com/office/drawing/2016/5/11/chartex" xmlns:cx6="http://schemas.microsoft.com/office/drawing/2016/5/12/chartex" xmlns:cx7="http://schemas.microsoft.com/office/drawing/2016/5/13/chartex" xmlns:cx8="http://schemas.microsoft.com/office/drawing/2016/5/14/chartex" xmlns:mc="http://schemas.openxmlformats.org/markup-compatibility/2006" xmlns:aink="http://schemas.microsoft.com/office/drawing/2016/ink" xmlns:am3d="http://schemas.microsoft.com/office/drawing/2017/model3d" xmlns:o="urn:schemas-microsoft-com:office:office" xmlns:r="http://schemas.openxmlformats.org/officeDocument/2006/relationships" xmlns:m="http://schemas.openxmlformats.org/officeDocument/2006/math" xmlns:v="urn:schemas-microsoft-com:vml" xmlns:wp14="http://schemas.microsoft.com/office/word/2010/wordprocessingDrawing" xmlns:wp="http://schemas.openxmlformats.org/drawingml/2006/wordprocessingDrawing" xmlns:w10="urn:schemas-microsoft-com:office:word" xmlns:w="http://schemas.openxmlformats.org/wordprocessingml/2006/main" xmlns:w14="http://schemas.microsoft.com/office/word/2010/wordml" xmlns:w15="http://schemas.microsoft.com/office/word/2012/wordml" xmlns:w16cex="http://schemas.microsoft.com/office/word/2018/wordml/cex" xmlns:w16cid="http://schemas.microsoft.com/office/word/2016/wordml/cid" xmlns:w16="http://schemas.microsoft.com/office/word/2018/wordml" xmlns:w16sdtdh="http://schemas.microsoft.com/office/word/2020/wordml/sdtdatahash" xmlns:w16se="http://schemas.microsoft.com/office/word/2015/wordml/symex" xmlns:wpg="http://schemas.microsoft.com/office/word/2010/wordprocessingGroup" xmlns:wpi="http://schemas.microsoft.com/office/word/2010/wordprocessingInk" xmlns:wne="http://schemas.microsoft.com/office/word/2006/wordml" xmlns:wps="http://schemas.microsoft.com/office/word/2010/wordprocessingShape" mc:Ignorable="w14 w15 w16se w16cid w16 w16cex w16sdtdh wp14">
+  <w:footnote w:type="separator" w:id="-1">
+    <w:p>
+      <w:pPr>
+        <w:spacing w:after="0" w:line="240" w:lineRule="auto"/>
+      </w:pPr>
+      <w:r>
+        <w:separator/>
+      </w:r>
+    </w:p>
+  </w:footnote>
+  <w:footnote w:type="continuationSeparator" w:id="0">
+    <w:p>
+      <w:pPr>
+        <w:spacing w:after="0" w:line="240" w:lineRule="auto"/>
+      </w:pPr>
+      <w:r>
+        <w:continuationSeparator/>
+      </w:r>
+    </w:p>
+  </w:footnote>
+</w:footnotes>
 </file>
 
 <file path=word/styles.xml><?xml version="1.0" encoding="utf-8"?>
@@ -10468,6 +13670,50 @@
     <w:basedOn w:val="Fuentedeprrafopredeter"/>
     <w:rsid w:val="00426D86"/>
   </w:style>
+  <w:style w:type="paragraph" w:styleId="Encabezado">
+    <w:name w:val="header"/>
+    <w:basedOn w:val="Normal"/>
+    <w:link w:val="EncabezadoCar"/>
+    <w:uiPriority w:val="99"/>
+    <w:unhideWhenUsed/>
+    <w:rsid w:val="00A12FDE"/>
+    <w:pPr>
+      <w:tabs>
+        <w:tab w:val="center" w:pos="4252"/>
+        <w:tab w:val="right" w:pos="8504"/>
+      </w:tabs>
+      <w:spacing w:after="0" w:line="240" w:lineRule="auto"/>
+    </w:pPr>
+  </w:style>
+  <w:style w:type="character" w:customStyle="1" w:styleId="EncabezadoCar">
+    <w:name w:val="Encabezado Car"/>
+    <w:basedOn w:val="Fuentedeprrafopredeter"/>
+    <w:link w:val="Encabezado"/>
+    <w:uiPriority w:val="99"/>
+    <w:rsid w:val="00A12FDE"/>
+  </w:style>
+  <w:style w:type="paragraph" w:styleId="Piedepgina">
+    <w:name w:val="footer"/>
+    <w:basedOn w:val="Normal"/>
+    <w:link w:val="PiedepginaCar"/>
+    <w:uiPriority w:val="99"/>
+    <w:unhideWhenUsed/>
+    <w:rsid w:val="00A12FDE"/>
+    <w:pPr>
+      <w:tabs>
+        <w:tab w:val="center" w:pos="4252"/>
+        <w:tab w:val="right" w:pos="8504"/>
+      </w:tabs>
+      <w:spacing w:after="0" w:line="240" w:lineRule="auto"/>
+    </w:pPr>
+  </w:style>
+  <w:style w:type="character" w:customStyle="1" w:styleId="PiedepginaCar">
+    <w:name w:val="Pie de página Car"/>
+    <w:basedOn w:val="Fuentedeprrafopredeter"/>
+    <w:link w:val="Piedepgina"/>
+    <w:uiPriority w:val="99"/>
+    <w:rsid w:val="00A12FDE"/>
+  </w:style>
 </w:styles>
 </file>
 

</xml_diff>